<commit_message>
Finished DMP activity + added images to slides
</commit_message>
<xml_diff>
--- a/datamanagementplan/exampleDMP.docx
+++ b/datamanagementplan/exampleDMP.docx
@@ -108,14 +108,6 @@
     </w:p>
     <w:p>
       <w:pPr>
-        <w:rPr>
-          <w:b/>
-          <w:lang w:val="en-GB"/>
-        </w:rPr>
-      </w:pPr>
-    </w:p>
-    <w:p>
-      <w:pPr>
         <w:spacing w:after="240"/>
         <w:rPr>
           <w:bCs/>
@@ -165,6 +157,8 @@
         <w:spacing w:after="240"/>
         <w:rPr>
           <w:bCs/>
+          <w:i/>
+          <w:iCs/>
           <w:color w:val="EE0000"/>
           <w:lang w:val="en-GB"/>
         </w:rPr>
@@ -228,6 +222,8 @@
       <w:r>
         <w:rPr>
           <w:bCs/>
+          <w:i/>
+          <w:iCs/>
           <w:color w:val="EE0000"/>
           <w:lang w:val="en-GB"/>
         </w:rPr>
@@ -239,6 +235,8 @@
         <w:spacing w:after="240"/>
         <w:rPr>
           <w:bCs/>
+          <w:i/>
+          <w:iCs/>
           <w:color w:val="EE0000"/>
           <w:lang w:val="en-GB"/>
         </w:rPr>
@@ -246,6 +244,8 @@
       <w:r>
         <w:rPr>
           <w:bCs/>
+          <w:i/>
+          <w:iCs/>
           <w:color w:val="EE0000"/>
           <w:lang w:val="en-GB"/>
         </w:rPr>
@@ -275,7 +275,7 @@
           <w:shd w:val="clear" w:color="auto" w:fill="C1E4F5" w:themeFill="accent1" w:themeFillTint="33"/>
           <w:lang w:val="en-GB"/>
         </w:rPr>
-        <w:t>Data collection and documentation</w:t>
+        <w:t>Data collection</w:t>
       </w:r>
     </w:p>
     <w:p>
@@ -304,42 +304,6 @@
         <w:spacing w:after="240"/>
         <w:rPr>
           <w:bCs/>
-          <w:color w:val="EE0000"/>
-          <w:lang w:val="en-GB"/>
-        </w:rPr>
-      </w:pPr>
-      <w:r>
-        <w:rPr>
-          <w:bCs/>
-          <w:color w:val="EE0000"/>
-          <w:lang w:val="en-GB"/>
-        </w:rPr>
-        <w:t xml:space="preserve">No data on file formats, no idea if all new or some reuse, </w:t>
-      </w:r>
-      <w:proofErr w:type="gramStart"/>
-      <w:r>
-        <w:rPr>
-          <w:bCs/>
-          <w:color w:val="EE0000"/>
-          <w:lang w:val="en-GB"/>
-        </w:rPr>
-        <w:t>unrealistic estimated</w:t>
-      </w:r>
-      <w:proofErr w:type="gramEnd"/>
-      <w:r>
-        <w:rPr>
-          <w:bCs/>
-          <w:color w:val="EE0000"/>
-          <w:lang w:val="en-GB"/>
-        </w:rPr>
-        <w:t xml:space="preserve"> volume</w:t>
-      </w:r>
-    </w:p>
-    <w:p>
-      <w:pPr>
-        <w:spacing w:after="240"/>
-        <w:rPr>
-          <w:bCs/>
           <w:i/>
           <w:iCs/>
           <w:lang w:val="en-GB"/>
@@ -588,6 +552,28 @@
         <w:spacing w:after="240"/>
         <w:rPr>
           <w:bCs/>
+          <w:i/>
+          <w:iCs/>
+          <w:color w:val="EE0000"/>
+          <w:lang w:val="en-GB"/>
+        </w:rPr>
+      </w:pPr>
+      <w:r>
+        <w:rPr>
+          <w:bCs/>
+          <w:i/>
+          <w:iCs/>
+          <w:color w:val="EE0000"/>
+          <w:lang w:val="en-GB"/>
+        </w:rPr>
+        <w:t>No data on file formats; no idea if all new or some reuse; unrealistic volume</w:t>
+      </w:r>
+    </w:p>
+    <w:p>
+      <w:pPr>
+        <w:spacing w:after="240"/>
+        <w:rPr>
+          <w:bCs/>
           <w:lang w:val="en-GB"/>
         </w:rPr>
       </w:pPr>
@@ -652,58 +638,90 @@
           <w:bCs/>
           <w:lang w:val="en-GB"/>
         </w:rPr>
-        <w:t xml:space="preserve">Reuse from online repositories of fossil specimen occurrences (e.g., the Paleobiology Database, Global Biodiversity Information Facility, </w:t>
-      </w:r>
-      <w:proofErr w:type="spellStart"/>
-      <w:r>
-        <w:rPr>
-          <w:bCs/>
-          <w:lang w:val="en-GB"/>
-        </w:rPr>
-        <w:t>IDigBio</w:t>
-      </w:r>
-      <w:proofErr w:type="spellEnd"/>
-      <w:r>
-        <w:rPr>
-          <w:bCs/>
-          <w:lang w:val="en-GB"/>
-        </w:rPr>
-        <w:t>, digital museum collection records, etc.).</w:t>
-      </w:r>
-      <w:r>
-        <w:rPr>
-          <w:bCs/>
-          <w:lang w:val="en-GB"/>
-        </w:rPr>
-        <w:t xml:space="preserve"> These are licensed to allow reuse and modification, the original locations will always be cited, and sharing </w:t>
-      </w:r>
-      <w:r>
-        <w:rPr>
-          <w:bCs/>
-          <w:lang w:val="en-GB"/>
-        </w:rPr>
-        <w:t xml:space="preserve">permission </w:t>
-      </w:r>
-      <w:r>
-        <w:rPr>
-          <w:bCs/>
-          <w:lang w:val="en-GB"/>
-        </w:rPr>
-        <w:t>will be confirmed</w:t>
-      </w:r>
-      <w:r>
-        <w:rPr>
-          <w:bCs/>
-          <w:lang w:val="en-GB"/>
-        </w:rPr>
-        <w:t xml:space="preserve"> prior to publication of the reused data.</w:t>
-      </w:r>
-      <w:r>
-        <w:rPr>
-          <w:bCs/>
-          <w:lang w:val="en-GB"/>
-        </w:rPr>
-        <w:t xml:space="preserve"> </w:t>
+        <w:t>Reuse from online repositories of fossil specimen occurrences</w:t>
+      </w:r>
+    </w:p>
+    <w:p>
+      <w:pPr>
+        <w:pStyle w:val="ListParagraph"/>
+        <w:spacing w:after="240"/>
+        <w:ind w:left="1440"/>
+        <w:rPr>
+          <w:bCs/>
+          <w:i/>
+          <w:iCs/>
+          <w:lang w:val="en-GB"/>
+        </w:rPr>
+      </w:pPr>
+      <w:r>
+        <w:rPr>
+          <w:bCs/>
+          <w:i/>
+          <w:iCs/>
+          <w:color w:val="EE0000"/>
+          <w:lang w:val="en-GB"/>
+        </w:rPr>
+        <w:t>No detail o</w:t>
+      </w:r>
+      <w:r>
+        <w:rPr>
+          <w:bCs/>
+          <w:i/>
+          <w:iCs/>
+          <w:color w:val="EE0000"/>
+          <w:lang w:val="en-GB"/>
+        </w:rPr>
+        <w:t>n</w:t>
+      </w:r>
+      <w:r>
+        <w:rPr>
+          <w:bCs/>
+          <w:i/>
+          <w:iCs/>
+          <w:color w:val="EE0000"/>
+          <w:lang w:val="en-GB"/>
+        </w:rPr>
+        <w:t xml:space="preserve"> which repositories </w:t>
+      </w:r>
+      <w:r>
+        <w:rPr>
+          <w:bCs/>
+          <w:i/>
+          <w:iCs/>
+          <w:color w:val="EE0000"/>
+          <w:lang w:val="en-GB"/>
+        </w:rPr>
+        <w:t>reuse data are from;</w:t>
+      </w:r>
+      <w:r>
+        <w:rPr>
+          <w:bCs/>
+          <w:i/>
+          <w:iCs/>
+          <w:color w:val="EE0000"/>
+          <w:lang w:val="en-GB"/>
+        </w:rPr>
+        <w:t xml:space="preserve"> no notes on </w:t>
+      </w:r>
+      <w:r>
+        <w:rPr>
+          <w:bCs/>
+          <w:i/>
+          <w:iCs/>
+          <w:color w:val="EE0000"/>
+          <w:lang w:val="en-GB"/>
+        </w:rPr>
+        <w:t>citing</w:t>
+      </w:r>
+      <w:r>
+        <w:rPr>
+          <w:bCs/>
+          <w:i/>
+          <w:iCs/>
+          <w:color w:val="EE0000"/>
+          <w:lang w:val="en-GB"/>
+        </w:rPr>
+        <w:t xml:space="preserve"> or sharing permissions</w:t>
       </w:r>
     </w:p>
     <w:p>
@@ -724,31 +742,7 @@
           <w:bCs/>
           <w:lang w:val="en-GB"/>
         </w:rPr>
-        <w:lastRenderedPageBreak/>
-        <w:t xml:space="preserve">Collation of data in the published </w:t>
-      </w:r>
-      <w:proofErr w:type="gramStart"/>
-      <w:r>
-        <w:rPr>
-          <w:bCs/>
-          <w:lang w:val="en-GB"/>
-        </w:rPr>
-        <w:t>literature, and</w:t>
-      </w:r>
-      <w:proofErr w:type="gramEnd"/>
-      <w:r>
-        <w:rPr>
-          <w:bCs/>
-          <w:lang w:val="en-GB"/>
-        </w:rPr>
-        <w:t xml:space="preserve"> collected by the author for other relevant research projects.</w:t>
-      </w:r>
-      <w:r>
-        <w:rPr>
-          <w:bCs/>
-          <w:lang w:val="en-GB"/>
-        </w:rPr>
-        <w:t xml:space="preserve"> Published literature sources will always be cited with the relevant data, and no original data will be shared from the publications without permission</w:t>
+        <w:t>Collation of data in the published literature</w:t>
       </w:r>
     </w:p>
     <w:p>
@@ -769,30 +763,7 @@
           <w:bCs/>
           <w:lang w:val="en-GB"/>
         </w:rPr>
-        <w:t xml:space="preserve">Recording of data entries for fossil specimens present in museum collections or found through field work </w:t>
-      </w:r>
-      <w:proofErr w:type="gramStart"/>
-      <w:r>
-        <w:rPr>
-          <w:bCs/>
-          <w:lang w:val="en-GB"/>
-        </w:rPr>
-        <w:t>during the course of</w:t>
-      </w:r>
-      <w:proofErr w:type="gramEnd"/>
-      <w:r>
-        <w:rPr>
-          <w:bCs/>
-          <w:lang w:val="en-GB"/>
-        </w:rPr>
-        <w:t xml:space="preserve"> the project, by the author, collaborators, or group members.</w:t>
-      </w:r>
-      <w:r>
-        <w:rPr>
-          <w:bCs/>
-          <w:lang w:val="en-GB"/>
-        </w:rPr>
-        <w:t xml:space="preserve"> Sharing and permissions will be discussed with curators in all cases.</w:t>
+        <w:t>Recording of data entries for fossil specimens present in museum collections or found through field work during the project</w:t>
       </w:r>
     </w:p>
     <w:p>
@@ -813,7 +784,7 @@
           <w:bCs/>
           <w:lang w:val="en-GB"/>
         </w:rPr>
-        <w:t>1.1.2 and 1.1.3 will be generated through a combination of:</w:t>
+        <w:t>1.1.2 will be generated through:</w:t>
       </w:r>
     </w:p>
     <w:p>
@@ -834,7 +805,7 @@
           <w:bCs/>
           <w:lang w:val="en-GB"/>
         </w:rPr>
-        <w:t>2D photography by the author, collaborators, or group members.</w:t>
+        <w:t>2D photography</w:t>
       </w:r>
     </w:p>
     <w:p>
@@ -855,148 +826,147 @@
           <w:bCs/>
           <w:lang w:val="en-GB"/>
         </w:rPr>
-        <w:t>Photogrammetry (the capturing and stitching of many 2D photographs from different angles to produce digital 3D surface models) by the author, collaborators, or group members.</w:t>
+        <w:lastRenderedPageBreak/>
+        <w:t>Reu</w:t>
+      </w:r>
+      <w:r>
+        <w:rPr>
+          <w:bCs/>
+          <w:lang w:val="en-GB"/>
+        </w:rPr>
+        <w:t xml:space="preserve">se of CC-licensed </w:t>
+      </w:r>
+      <w:r>
+        <w:rPr>
+          <w:bCs/>
+          <w:lang w:val="en-GB"/>
+        </w:rPr>
+        <w:t>photographs</w:t>
       </w:r>
     </w:p>
     <w:p>
       <w:pPr>
         <w:pStyle w:val="ListParagraph"/>
-        <w:numPr>
-          <w:ilvl w:val="1"/>
-          <w:numId w:val="3"/>
-        </w:numPr>
-        <w:spacing w:after="240"/>
-        <w:rPr>
-          <w:bCs/>
-          <w:lang w:val="en-GB"/>
-        </w:rPr>
-      </w:pPr>
-      <w:r>
-        <w:rPr>
-          <w:bCs/>
-          <w:lang w:val="en-GB"/>
-        </w:rPr>
-        <w:t>Manual creation of digital 3D models by the author, collaborators, or group members using freeware Blender.</w:t>
-      </w:r>
-    </w:p>
-    <w:p>
-      <w:pPr>
-        <w:pStyle w:val="ListParagraph"/>
-        <w:numPr>
-          <w:ilvl w:val="1"/>
-          <w:numId w:val="3"/>
-        </w:numPr>
-        <w:spacing w:after="240"/>
-        <w:rPr>
-          <w:bCs/>
-          <w:lang w:val="en-GB"/>
-        </w:rPr>
-      </w:pPr>
-      <w:r>
-        <w:rPr>
-          <w:bCs/>
-          <w:lang w:val="en-GB"/>
-        </w:rPr>
-        <w:t>Reu</w:t>
-      </w:r>
-      <w:r>
-        <w:rPr>
-          <w:bCs/>
-          <w:lang w:val="en-GB"/>
-        </w:rPr>
-        <w:t xml:space="preserve">se of CC-licensed 2D and 3D models available online in various repositories (e.g., </w:t>
+        <w:spacing w:after="240"/>
+        <w:ind w:left="1440"/>
+        <w:rPr>
+          <w:bCs/>
+          <w:i/>
+          <w:iCs/>
+          <w:lang w:val="en-GB"/>
+        </w:rPr>
+      </w:pPr>
+      <w:r>
+        <w:rPr>
+          <w:bCs/>
+          <w:i/>
+          <w:iCs/>
+          <w:color w:val="EE0000"/>
+          <w:lang w:val="en-GB"/>
+        </w:rPr>
+        <w:t xml:space="preserve">Where from? Publications, </w:t>
       </w:r>
       <w:proofErr w:type="spellStart"/>
       <w:r>
         <w:rPr>
           <w:bCs/>
-          <w:lang w:val="en-GB"/>
-        </w:rPr>
-        <w:t>MorphoSource</w:t>
+          <w:i/>
+          <w:iCs/>
+          <w:color w:val="EE0000"/>
+          <w:lang w:val="en-GB"/>
+        </w:rPr>
+        <w:t>i</w:t>
+      </w:r>
+      <w:r>
+        <w:rPr>
+          <w:bCs/>
+          <w:i/>
+          <w:iCs/>
+          <w:color w:val="EE0000"/>
+          <w:lang w:val="en-GB"/>
+        </w:rPr>
+        <w:t>D</w:t>
+      </w:r>
+      <w:r>
+        <w:rPr>
+          <w:bCs/>
+          <w:i/>
+          <w:iCs/>
+          <w:color w:val="EE0000"/>
+          <w:lang w:val="en-GB"/>
+        </w:rPr>
+        <w:t>ig</w:t>
+      </w:r>
+      <w:r>
+        <w:rPr>
+          <w:bCs/>
+          <w:i/>
+          <w:iCs/>
+          <w:color w:val="EE0000"/>
+          <w:lang w:val="en-GB"/>
+        </w:rPr>
+        <w:t>B</w:t>
+      </w:r>
+      <w:r>
+        <w:rPr>
+          <w:bCs/>
+          <w:i/>
+          <w:iCs/>
+          <w:color w:val="EE0000"/>
+          <w:lang w:val="en-GB"/>
+        </w:rPr>
+        <w:t>io</w:t>
       </w:r>
       <w:proofErr w:type="spellEnd"/>
       <w:r>
         <w:rPr>
           <w:bCs/>
-          <w:lang w:val="en-GB"/>
-        </w:rPr>
-        <w:t xml:space="preserve">, </w:t>
-      </w:r>
-      <w:proofErr w:type="spellStart"/>
-      <w:r>
-        <w:rPr>
-          <w:bCs/>
-          <w:lang w:val="en-GB"/>
-        </w:rPr>
-        <w:t>iDigBio</w:t>
-      </w:r>
-      <w:proofErr w:type="spellEnd"/>
-      <w:r>
-        <w:rPr>
-          <w:bCs/>
-          <w:lang w:val="en-GB"/>
-        </w:rPr>
-        <w:t xml:space="preserve">, digital museum collection records, </w:t>
-      </w:r>
-      <w:r>
-        <w:rPr>
-          <w:bCs/>
-          <w:lang w:val="en-GB"/>
-        </w:rPr>
-        <w:t>Z</w:t>
-      </w:r>
-      <w:r>
-        <w:rPr>
-          <w:bCs/>
-          <w:lang w:val="en-GB"/>
-        </w:rPr>
-        <w:t xml:space="preserve">enodo, </w:t>
-      </w:r>
-      <w:proofErr w:type="spellStart"/>
-      <w:r>
-        <w:rPr>
-          <w:bCs/>
-          <w:lang w:val="en-GB"/>
-        </w:rPr>
-        <w:t>figshare</w:t>
-      </w:r>
-      <w:proofErr w:type="spellEnd"/>
-      <w:r>
-        <w:rPr>
-          <w:bCs/>
-          <w:lang w:val="en-GB"/>
-        </w:rPr>
-        <w:t xml:space="preserve">, </w:t>
-      </w:r>
-      <w:r>
-        <w:rPr>
-          <w:bCs/>
-          <w:lang w:val="en-GB"/>
-        </w:rPr>
-        <w:t xml:space="preserve">published literature, </w:t>
-      </w:r>
-      <w:r>
-        <w:rPr>
-          <w:bCs/>
-          <w:lang w:val="en-GB"/>
-        </w:rPr>
-        <w:t>etc.).</w:t>
-      </w:r>
-    </w:p>
-    <w:p>
-      <w:pPr>
-        <w:spacing w:after="240"/>
-        <w:rPr>
-          <w:b/>
-          <w:lang w:val="en-GB"/>
-        </w:rPr>
-      </w:pPr>
-      <w:r>
-        <w:rPr>
-          <w:b/>
-          <w:lang w:val="en-GB"/>
-        </w:rPr>
-        <w:t>1.3</w:t>
+          <w:i/>
+          <w:iCs/>
+          <w:color w:val="EE0000"/>
+          <w:lang w:val="en-GB"/>
+        </w:rPr>
+        <w:t>?</w:t>
+      </w:r>
+    </w:p>
+    <w:p>
+      <w:pPr>
+        <w:shd w:val="clear" w:color="auto" w:fill="C1E4F5" w:themeFill="accent1" w:themeFillTint="33"/>
+        <w:spacing w:after="240"/>
+        <w:rPr>
+          <w:b/>
+          <w:lang w:val="en-GB"/>
+        </w:rPr>
+      </w:pPr>
+      <w:r>
+        <w:rPr>
+          <w:b/>
+          <w:lang w:val="en-GB"/>
+        </w:rPr>
+        <w:t xml:space="preserve">2 </w:t>
+      </w:r>
+      <w:r>
+        <w:rPr>
+          <w:b/>
+          <w:lang w:val="en-GB"/>
+        </w:rPr>
+        <w:t>Data documentation</w:t>
+      </w:r>
+    </w:p>
+    <w:p>
+      <w:pPr>
+        <w:spacing w:after="240"/>
+        <w:rPr>
+          <w:b/>
+          <w:lang w:val="en-GB"/>
+        </w:rPr>
+      </w:pPr>
+      <w:r>
+        <w:rPr>
+          <w:b/>
+          <w:lang w:val="en-GB"/>
+        </w:rPr>
+        <w:t>2.1</w:t>
       </w:r>
       <w:r>
         <w:rPr>
@@ -1031,105 +1001,36 @@
           <w:bCs/>
           <w:lang w:val="en-GB"/>
         </w:rPr>
-        <w:t>File structure:</w:t>
+        <w:t xml:space="preserve">Each folder will contain a README </w:t>
+      </w:r>
+      <w:r>
+        <w:rPr>
+          <w:bCs/>
+          <w:lang w:val="en-GB"/>
+        </w:rPr>
+        <w:t>metadata file</w:t>
       </w:r>
     </w:p>
     <w:p>
       <w:pPr>
         <w:pStyle w:val="ListParagraph"/>
-        <w:numPr>
-          <w:ilvl w:val="1"/>
-          <w:numId w:val="4"/>
-        </w:numPr>
-        <w:spacing w:after="240"/>
-        <w:rPr>
-          <w:bCs/>
-          <w:lang w:val="en-GB"/>
-        </w:rPr>
-      </w:pPr>
-      <w:r>
-        <w:rPr>
-          <w:bCs/>
-          <w:lang w:val="en-GB"/>
-        </w:rPr>
-        <w:t xml:space="preserve">All project data will follow a hierarchical file structure, ideally with a singular head folder </w:t>
-      </w:r>
-      <w:r>
-        <w:rPr>
-          <w:bCs/>
-          <w:lang w:val="en-GB"/>
-        </w:rPr>
-        <w:t xml:space="preserve">(collated within a single Community on Zenodo) </w:t>
-      </w:r>
-      <w:r>
-        <w:rPr>
-          <w:bCs/>
-          <w:lang w:val="en-GB"/>
-        </w:rPr>
-        <w:t xml:space="preserve">although this </w:t>
-      </w:r>
-      <w:r>
-        <w:rPr>
-          <w:bCs/>
-          <w:lang w:val="en-GB"/>
-        </w:rPr>
-        <w:t xml:space="preserve">may </w:t>
-      </w:r>
-      <w:r>
-        <w:rPr>
-          <w:bCs/>
-          <w:lang w:val="en-GB"/>
-        </w:rPr>
-        <w:t>depend on online repository capacity and file sizes.</w:t>
-      </w:r>
-      <w:r>
-        <w:rPr>
-          <w:bCs/>
-          <w:lang w:val="en-GB"/>
-        </w:rPr>
-        <w:t xml:space="preserve"> Data stored locally will also follow this hierarchical structure.</w:t>
-      </w:r>
-    </w:p>
-    <w:p>
-      <w:pPr>
-        <w:pStyle w:val="ListParagraph"/>
-        <w:numPr>
-          <w:ilvl w:val="1"/>
-          <w:numId w:val="4"/>
-        </w:numPr>
-        <w:spacing w:after="240"/>
-        <w:rPr>
-          <w:bCs/>
-          <w:lang w:val="en-GB"/>
-        </w:rPr>
-      </w:pPr>
-      <w:r>
-        <w:rPr>
-          <w:bCs/>
-          <w:lang w:val="en-GB"/>
-        </w:rPr>
-        <w:t>Individual folders for each of research objective.</w:t>
-      </w:r>
-    </w:p>
-    <w:p>
-      <w:pPr>
-        <w:pStyle w:val="ListParagraph"/>
-        <w:numPr>
-          <w:ilvl w:val="1"/>
-          <w:numId w:val="4"/>
-        </w:numPr>
-        <w:spacing w:after="240"/>
-        <w:rPr>
-          <w:bCs/>
-          <w:lang w:val="en-GB"/>
-        </w:rPr>
-      </w:pPr>
-      <w:r>
-        <w:rPr>
-          <w:bCs/>
-          <w:lang w:val="en-GB"/>
-        </w:rPr>
-        <w:t>A visual summary of the total project file architecture will be kept, which will demonstrate the links between different repository folders if needed to be separated.</w:t>
+        <w:spacing w:after="240"/>
+        <w:rPr>
+          <w:bCs/>
+          <w:i/>
+          <w:iCs/>
+          <w:lang w:val="en-GB"/>
+        </w:rPr>
+      </w:pPr>
+      <w:r>
+        <w:rPr>
+          <w:bCs/>
+          <w:i/>
+          <w:iCs/>
+          <w:color w:val="EE0000"/>
+          <w:lang w:val="en-GB"/>
+        </w:rPr>
+        <w:t>More detail on what is in the README: .txt, explains contents and file names, signposts any software needed</w:t>
       </w:r>
     </w:p>
     <w:p>
@@ -1150,77 +1051,7 @@
           <w:bCs/>
           <w:lang w:val="en-GB"/>
         </w:rPr>
-        <w:t>Metadata:</w:t>
-      </w:r>
-    </w:p>
-    <w:p>
-      <w:pPr>
-        <w:pStyle w:val="ListParagraph"/>
-        <w:numPr>
-          <w:ilvl w:val="1"/>
-          <w:numId w:val="4"/>
-        </w:numPr>
-        <w:spacing w:after="240"/>
-        <w:rPr>
-          <w:bCs/>
-          <w:lang w:val="en-GB"/>
-        </w:rPr>
-      </w:pPr>
-      <w:r>
-        <w:rPr>
-          <w:bCs/>
-          <w:lang w:val="en-GB"/>
-        </w:rPr>
-        <w:t xml:space="preserve">Each folder will contain a README .txt file that </w:t>
-      </w:r>
-      <w:r>
-        <w:rPr>
-          <w:bCs/>
-          <w:lang w:val="en-GB"/>
-        </w:rPr>
-        <w:t>details the data contained within, lists the filenames and content, relates the files to the overall project, and notes any related or needed tools or software.</w:t>
-      </w:r>
-    </w:p>
-    <w:p>
-      <w:pPr>
-        <w:pStyle w:val="ListParagraph"/>
-        <w:numPr>
-          <w:ilvl w:val="1"/>
-          <w:numId w:val="4"/>
-        </w:numPr>
-        <w:spacing w:after="240"/>
-        <w:rPr>
-          <w:bCs/>
-          <w:lang w:val="en-GB"/>
-        </w:rPr>
-      </w:pPr>
-      <w:r>
-        <w:rPr>
-          <w:bCs/>
-          <w:lang w:val="en-GB"/>
-        </w:rPr>
-        <w:t>These metadata files will also explain any variables, codes or abbreviations use within the data files.</w:t>
-      </w:r>
-    </w:p>
-    <w:p>
-      <w:pPr>
-        <w:pStyle w:val="ListParagraph"/>
-        <w:numPr>
-          <w:ilvl w:val="1"/>
-          <w:numId w:val="4"/>
-        </w:numPr>
-        <w:spacing w:after="240"/>
-        <w:rPr>
-          <w:bCs/>
-          <w:lang w:val="en-GB"/>
-        </w:rPr>
-      </w:pPr>
-      <w:r>
-        <w:rPr>
-          <w:bCs/>
-          <w:lang w:val="en-GB"/>
-        </w:rPr>
-        <w:t>All relevant protocol (e.g., experimental protocol needed to generate 1.1.6) will always be published and signposted alongside their data, to facilitate interpretation and reuse.</w:t>
+        <w:t>Raw versions of all data files for 1.1.1 will be kept that are date-stamped and unedited to support transparency and reproducibility</w:t>
       </w:r>
     </w:p>
     <w:p>
@@ -1241,119 +1072,7 @@
           <w:bCs/>
           <w:lang w:val="en-GB"/>
         </w:rPr>
-        <w:t>Data master files:</w:t>
-      </w:r>
-    </w:p>
-    <w:p>
-      <w:pPr>
-        <w:pStyle w:val="ListParagraph"/>
-        <w:numPr>
-          <w:ilvl w:val="1"/>
-          <w:numId w:val="4"/>
-        </w:numPr>
-        <w:spacing w:after="240"/>
-        <w:rPr>
-          <w:bCs/>
-          <w:lang w:val="en-GB"/>
-        </w:rPr>
-      </w:pPr>
-      <w:r>
-        <w:rPr>
-          <w:bCs/>
-          <w:lang w:val="en-GB"/>
-        </w:rPr>
-        <w:t xml:space="preserve">Data files for 1.1.1 </w:t>
-      </w:r>
-      <w:r>
-        <w:rPr>
-          <w:bCs/>
-          <w:lang w:val="en-GB"/>
-        </w:rPr>
-        <w:t>will always have an immutable master file</w:t>
-      </w:r>
-      <w:r>
-        <w:rPr>
-          <w:bCs/>
-          <w:lang w:val="en-GB"/>
-        </w:rPr>
-        <w:t xml:space="preserve"> version</w:t>
-      </w:r>
-      <w:r>
-        <w:rPr>
-          <w:bCs/>
-          <w:lang w:val="en-GB"/>
-        </w:rPr>
-        <w:t xml:space="preserve"> that is date-stamped and kept unedited as a .csv to allow full transparency and reproducibility</w:t>
-      </w:r>
-      <w:r>
-        <w:rPr>
-          <w:bCs/>
-          <w:lang w:val="en-GB"/>
-        </w:rPr>
-        <w:t xml:space="preserve"> (i.e., a ‘raw’ dataset with no changes made to it)</w:t>
-      </w:r>
-      <w:r>
-        <w:rPr>
-          <w:bCs/>
-          <w:lang w:val="en-GB"/>
-        </w:rPr>
-        <w:t xml:space="preserve">. </w:t>
-      </w:r>
-    </w:p>
-    <w:p>
-      <w:pPr>
-        <w:pStyle w:val="ListParagraph"/>
-        <w:numPr>
-          <w:ilvl w:val="1"/>
-          <w:numId w:val="4"/>
-        </w:numPr>
-        <w:spacing w:after="240"/>
-        <w:rPr>
-          <w:bCs/>
-          <w:lang w:val="en-GB"/>
-        </w:rPr>
-      </w:pPr>
-      <w:r>
-        <w:rPr>
-          <w:bCs/>
-          <w:lang w:val="en-GB"/>
-        </w:rPr>
-        <w:t xml:space="preserve">All changes made to these </w:t>
-      </w:r>
-      <w:r>
-        <w:rPr>
-          <w:bCs/>
-          <w:lang w:val="en-GB"/>
-        </w:rPr>
-        <w:t>raw</w:t>
-      </w:r>
-      <w:r>
-        <w:rPr>
-          <w:bCs/>
-          <w:lang w:val="en-GB"/>
-        </w:rPr>
-        <w:t xml:space="preserve"> datasets to create processed data files will be scripted (usually in R)</w:t>
-      </w:r>
-      <w:r>
-        <w:rPr>
-          <w:bCs/>
-          <w:lang w:val="en-GB"/>
-        </w:rPr>
-        <w:t xml:space="preserve"> and the code provided alongside</w:t>
-      </w:r>
-      <w:r>
-        <w:rPr>
-          <w:bCs/>
-          <w:lang w:val="en-GB"/>
-        </w:rPr>
-        <w:t xml:space="preserve"> to allow for transparency and reproducibility</w:t>
-      </w:r>
-      <w:r>
-        <w:rPr>
-          <w:bCs/>
-          <w:lang w:val="en-GB"/>
-        </w:rPr>
-        <w:t>.</w:t>
+        <w:t>Photographs (1.1.2) will have unique identifiers (e.g., museum accession numbers) included in their filenames</w:t>
       </w:r>
     </w:p>
     <w:p>
@@ -1374,125 +1093,70 @@
           <w:bCs/>
           <w:lang w:val="en-GB"/>
         </w:rPr>
-        <w:lastRenderedPageBreak/>
-        <w:t>Photographs (1.1.3) will have unique identifiers (e.g., museum accession numbers) included in their filenames, which will also be present in the relevant occurrence data files (1.1.1, 1.1.8) to allow cross-referencing.</w:t>
-      </w:r>
-    </w:p>
-    <w:p>
-      <w:pPr>
-        <w:pStyle w:val="ListParagraph"/>
-        <w:numPr>
-          <w:ilvl w:val="0"/>
-          <w:numId w:val="4"/>
-        </w:numPr>
-        <w:spacing w:after="240"/>
-        <w:rPr>
-          <w:bCs/>
-          <w:lang w:val="en-GB"/>
-        </w:rPr>
-      </w:pPr>
-      <w:r>
-        <w:rPr>
-          <w:bCs/>
-          <w:lang w:val="en-GB"/>
-        </w:rPr>
-        <w:t>All data files will be shared within open formats as far as possible.</w:t>
-      </w:r>
-      <w:r>
-        <w:rPr>
-          <w:bCs/>
-          <w:lang w:val="en-GB"/>
-        </w:rPr>
-        <w:t xml:space="preserve"> The process of converting across formats will be fully documented and the tools to do this (i.e., code) also provided (e.g., see 2).</w:t>
-      </w:r>
-    </w:p>
-    <w:p>
-      <w:pPr>
-        <w:spacing w:after="240"/>
-        <w:rPr>
-          <w:b/>
-          <w:lang w:val="en-GB"/>
-        </w:rPr>
-      </w:pPr>
-      <w:r>
-        <w:rPr>
-          <w:b/>
-          <w:lang w:val="en-GB"/>
-        </w:rPr>
-        <w:t>1.4 Management of working data</w:t>
-      </w:r>
-    </w:p>
-    <w:p>
-      <w:pPr>
-        <w:pStyle w:val="ListParagraph"/>
-        <w:numPr>
-          <w:ilvl w:val="0"/>
-          <w:numId w:val="16"/>
-        </w:numPr>
-        <w:spacing w:after="240"/>
-        <w:rPr>
-          <w:bCs/>
-          <w:lang w:val="en-GB"/>
-        </w:rPr>
-      </w:pPr>
-      <w:r>
-        <w:rPr>
-          <w:bCs/>
-          <w:lang w:val="en-GB"/>
-        </w:rPr>
-        <w:t>While research is ongoing, data will be stored locally with all locally stored data backed up to the UNIGE NAS (</w:t>
-      </w:r>
-      <w:r>
-        <w:rPr>
-          <w:bCs/>
-          <w:lang w:val="en-GB"/>
-        </w:rPr>
-        <w:t>https://catalogue-si.unige.ch/en/stockage-recherche</w:t>
-      </w:r>
-      <w:r>
-        <w:rPr>
-          <w:bCs/>
-          <w:lang w:val="en-GB"/>
-        </w:rPr>
-        <w:t>). This automatically takes a snapshot every 4 hours (retention 1 week) and every week (retention 6 weeks), with a magnetic tape backup every 48 hours (retention 730 days).</w:t>
-      </w:r>
-    </w:p>
-    <w:p>
-      <w:pPr>
-        <w:pStyle w:val="ListParagraph"/>
-        <w:numPr>
-          <w:ilvl w:val="0"/>
-          <w:numId w:val="16"/>
-        </w:numPr>
-        <w:spacing w:after="240"/>
-        <w:rPr>
-          <w:bCs/>
-          <w:lang w:val="en-GB"/>
-        </w:rPr>
-      </w:pPr>
-      <w:r>
-        <w:rPr>
-          <w:bCs/>
-          <w:lang w:val="en-GB"/>
-        </w:rPr>
-        <w:t>When data has passed out of the generation phase and is being used for analyses or awaiting publication, they will also be stored in online repositories (usually Zenodo) with restrictions on sharing (e.g., privately stored, embargoed) until publication (see 5).</w:t>
-      </w:r>
-    </w:p>
-    <w:p>
-      <w:pPr>
-        <w:shd w:val="clear" w:color="auto" w:fill="C1E4F5" w:themeFill="accent1" w:themeFillTint="33"/>
-        <w:spacing w:after="240"/>
-        <w:rPr>
-          <w:b/>
-          <w:lang w:val="en-GB"/>
-        </w:rPr>
-      </w:pPr>
-      <w:r>
-        <w:rPr>
-          <w:b/>
-          <w:lang w:val="en-GB"/>
-        </w:rPr>
-        <w:t>2 Related tools, software, and/or code</w:t>
+        <w:t>All data files will be shared within open formats as far as possible</w:t>
+      </w:r>
+    </w:p>
+    <w:p>
+      <w:pPr>
+        <w:spacing w:after="240"/>
+        <w:rPr>
+          <w:bCs/>
+          <w:i/>
+          <w:iCs/>
+          <w:color w:val="EE0000"/>
+          <w:lang w:val="en-GB"/>
+        </w:rPr>
+      </w:pPr>
+      <w:r>
+        <w:rPr>
+          <w:bCs/>
+          <w:i/>
+          <w:iCs/>
+          <w:color w:val="EE0000"/>
+          <w:lang w:val="en-GB"/>
+        </w:rPr>
+        <w:t>Add details on folder structure</w:t>
+      </w:r>
+      <w:r>
+        <w:rPr>
+          <w:bCs/>
+          <w:i/>
+          <w:iCs/>
+          <w:color w:val="EE0000"/>
+          <w:lang w:val="en-GB"/>
+        </w:rPr>
+        <w:br/>
+        <w:t>How will data be managed while the project is ongoing?</w:t>
+      </w:r>
+    </w:p>
+    <w:p>
+      <w:pPr>
+        <w:spacing w:after="240"/>
+        <w:rPr>
+          <w:b/>
+          <w:lang w:val="en-GB"/>
+        </w:rPr>
+      </w:pPr>
+      <w:r>
+        <w:rPr>
+          <w:b/>
+          <w:lang w:val="en-GB"/>
+        </w:rPr>
+        <w:t>2.</w:t>
+      </w:r>
+      <w:r>
+        <w:rPr>
+          <w:b/>
+          <w:lang w:val="en-GB"/>
+        </w:rPr>
+        <w:t>2</w:t>
+      </w:r>
+      <w:r>
+        <w:rPr>
+          <w:b/>
+          <w:lang w:val="en-GB"/>
+        </w:rPr>
+        <w:t xml:space="preserve"> Software and code</w:t>
       </w:r>
     </w:p>
     <w:p>
@@ -1513,151 +1177,47 @@
           <w:bCs/>
           <w:lang w:val="en-GB"/>
         </w:rPr>
-        <w:t xml:space="preserve">1.1.6: velocimeter data extraction </w:t>
-      </w:r>
-      <w:r>
-        <w:rPr>
-          <w:bCs/>
-          <w:lang w:val="en-GB"/>
-        </w:rPr>
-        <w:t xml:space="preserve">from the proprietary file format </w:t>
-      </w:r>
-      <w:r>
-        <w:rPr>
-          <w:bCs/>
-          <w:lang w:val="en-GB"/>
-        </w:rPr>
-        <w:t>requires R code, which is already published with Drage et al. (202</w:t>
-      </w:r>
-      <w:r>
-        <w:rPr>
-          <w:bCs/>
-          <w:lang w:val="en-GB"/>
-        </w:rPr>
-        <w:t>4</w:t>
-      </w:r>
-      <w:r>
-        <w:rPr>
-          <w:bCs/>
-          <w:lang w:val="en-GB"/>
-        </w:rPr>
-        <w:t>)</w:t>
-      </w:r>
-      <w:r>
-        <w:rPr>
-          <w:bCs/>
-          <w:lang w:val="en-GB"/>
-        </w:rPr>
-        <w:t>. We also published R code at the same DOI to extract the relevant data from the .txt files recording experimental forces, which improves access to the raw data files.</w:t>
+        <w:t>All code will be shared open access</w:t>
       </w:r>
     </w:p>
     <w:p>
       <w:pPr>
         <w:pStyle w:val="ListParagraph"/>
-        <w:numPr>
-          <w:ilvl w:val="0"/>
-          <w:numId w:val="6"/>
-        </w:numPr>
-        <w:spacing w:after="240"/>
-        <w:rPr>
-          <w:bCs/>
-          <w:lang w:val="en-GB"/>
-        </w:rPr>
-      </w:pPr>
-      <w:r>
-        <w:rPr>
-          <w:bCs/>
-          <w:lang w:val="en-GB"/>
-        </w:rPr>
-        <w:t>General principles regarding tools/software/code:</w:t>
-      </w:r>
-    </w:p>
-    <w:p>
-      <w:pPr>
-        <w:pStyle w:val="ListParagraph"/>
-        <w:numPr>
-          <w:ilvl w:val="1"/>
-          <w:numId w:val="6"/>
-        </w:numPr>
-        <w:spacing w:after="240"/>
-        <w:rPr>
-          <w:bCs/>
-          <w:lang w:val="en-GB"/>
-        </w:rPr>
-      </w:pPr>
-      <w:r>
-        <w:rPr>
-          <w:bCs/>
-          <w:lang w:val="en-GB"/>
-        </w:rPr>
-        <w:t>These will always be shared open access where they were used for data manipulation, cleaning, exploration, visualisation, or analysis for any published output.</w:t>
-      </w:r>
-    </w:p>
-    <w:p>
-      <w:pPr>
-        <w:pStyle w:val="ListParagraph"/>
-        <w:numPr>
-          <w:ilvl w:val="1"/>
-          <w:numId w:val="6"/>
-        </w:numPr>
-        <w:spacing w:after="240"/>
-        <w:rPr>
-          <w:bCs/>
-          <w:lang w:val="en-GB"/>
-        </w:rPr>
-      </w:pPr>
-      <w:r>
-        <w:rPr>
-          <w:bCs/>
-          <w:lang w:val="en-GB"/>
-        </w:rPr>
-        <w:t>These will be shared alongside the relevant data in the same repositories, or within a GitHub repository</w:t>
-      </w:r>
-      <w:r>
-        <w:rPr>
-          <w:bCs/>
-          <w:lang w:val="en-GB"/>
-        </w:rPr>
-        <w:t xml:space="preserve"> that is also released on Zenodo with a DOI</w:t>
-      </w:r>
-      <w:r>
-        <w:rPr>
-          <w:bCs/>
-          <w:lang w:val="en-GB"/>
-        </w:rPr>
-        <w:t>, whichever is most sensible.</w:t>
-      </w:r>
-    </w:p>
-    <w:p>
-      <w:pPr>
-        <w:pStyle w:val="ListParagraph"/>
-        <w:numPr>
-          <w:ilvl w:val="0"/>
-          <w:numId w:val="6"/>
-        </w:numPr>
-        <w:spacing w:after="240"/>
-        <w:rPr>
-          <w:bCs/>
-          <w:lang w:val="en-GB"/>
-        </w:rPr>
-      </w:pPr>
-      <w:r>
-        <w:rPr>
-          <w:bCs/>
-          <w:lang w:val="en-GB"/>
-        </w:rPr>
-        <w:t>All other data will be converted to open formats before sharing such that additional tools are not needed.</w:t>
-      </w:r>
-    </w:p>
-    <w:p>
-      <w:pPr>
-        <w:shd w:val="clear" w:color="auto" w:fill="C1E4F5" w:themeFill="accent1" w:themeFillTint="33"/>
-        <w:spacing w:after="240"/>
-        <w:rPr>
-          <w:b/>
-          <w:lang w:val="en-GB"/>
-        </w:rPr>
-      </w:pPr>
+        <w:spacing w:after="240"/>
+        <w:rPr>
+          <w:bCs/>
+          <w:i/>
+          <w:iCs/>
+          <w:color w:val="EE0000"/>
+          <w:lang w:val="en-GB"/>
+        </w:rPr>
+      </w:pPr>
+      <w:r>
+        <w:rPr>
+          <w:bCs/>
+          <w:i/>
+          <w:iCs/>
+          <w:color w:val="EE0000"/>
+          <w:lang w:val="en-GB"/>
+        </w:rPr>
+        <w:t>More detail would be helpful: any data with proprietary file formats that require conversion? Where to share code? Any software?</w:t>
+      </w:r>
+    </w:p>
+    <w:p>
+      <w:pPr>
+        <w:spacing w:after="240"/>
+        <w:rPr>
+          <w:b/>
+          <w:lang w:val="en-GB"/>
+        </w:rPr>
+      </w:pPr>
+      <w:r>
+        <w:rPr>
+          <w:b/>
+          <w:lang w:val="en-GB"/>
+        </w:rPr>
+        <w:t>2.</w:t>
+      </w:r>
       <w:r>
         <w:rPr>
           <w:b/>
@@ -1670,14 +1230,7 @@
           <w:b/>
           <w:lang w:val="en-GB"/>
         </w:rPr>
-        <w:t xml:space="preserve"> </w:t>
-      </w:r>
-      <w:r>
-        <w:rPr>
-          <w:b/>
-          <w:lang w:val="en-GB"/>
-        </w:rPr>
-        <w:t>Standards</w:t>
+        <w:t xml:space="preserve"> Standards</w:t>
       </w:r>
     </w:p>
     <w:p>
@@ -1698,28 +1251,7 @@
           <w:bCs/>
           <w:lang w:val="en-GB"/>
         </w:rPr>
-        <w:t>1.1.1</w:t>
-      </w:r>
-      <w:r>
-        <w:rPr>
-          <w:bCs/>
-          <w:lang w:val="en-GB"/>
-        </w:rPr>
-        <w:t xml:space="preserve"> and 1.1.</w:t>
-      </w:r>
-      <w:r>
-        <w:rPr>
-          <w:bCs/>
-          <w:lang w:val="en-GB"/>
-        </w:rPr>
-        <w:t>8</w:t>
-      </w:r>
-      <w:r>
-        <w:rPr>
-          <w:bCs/>
-          <w:lang w:val="en-GB"/>
-        </w:rPr>
-        <w:t>:</w:t>
+        <w:t>1.1.1:</w:t>
       </w:r>
     </w:p>
     <w:p>
@@ -1740,7 +1272,21 @@
           <w:bCs/>
           <w:lang w:val="en-GB"/>
         </w:rPr>
-        <w:t>All specimen occurrence data entries will have a unique identifier, which will usually be their museum accession number.</w:t>
+        <w:t xml:space="preserve">All specimen occurrence data entries will have a unique identifier, </w:t>
+      </w:r>
+      <w:r>
+        <w:rPr>
+          <w:bCs/>
+          <w:lang w:val="en-GB"/>
+        </w:rPr>
+        <w:t xml:space="preserve">usually </w:t>
+      </w:r>
+      <w:r>
+        <w:rPr>
+          <w:bCs/>
+          <w:lang w:val="en-GB"/>
+        </w:rPr>
+        <w:t>their museum accession number.</w:t>
       </w:r>
     </w:p>
     <w:p>
@@ -1824,7 +1370,21 @@
           <w:bCs/>
           <w:lang w:val="en-GB"/>
         </w:rPr>
-        <w:t xml:space="preserve">1.1.3: a scale bar will be included in at least one image of each photographed specimen. </w:t>
+        <w:t>1.1.</w:t>
+      </w:r>
+      <w:r>
+        <w:rPr>
+          <w:bCs/>
+          <w:lang w:val="en-GB"/>
+        </w:rPr>
+        <w:t>2</w:t>
+      </w:r>
+      <w:r>
+        <w:rPr>
+          <w:bCs/>
+          <w:lang w:val="en-GB"/>
+        </w:rPr>
+        <w:t xml:space="preserve">: a scale bar will be included in at least one image of each photographed specimen. </w:t>
       </w:r>
     </w:p>
     <w:p>
@@ -1845,7 +1405,29 @@
           <w:bCs/>
           <w:lang w:val="en-GB"/>
         </w:rPr>
-        <w:t>All data and their repositories (see 4) will confirm to FAIR standards.</w:t>
+        <w:t>All data and their repositories will confirm to FAIR standards.</w:t>
+      </w:r>
+    </w:p>
+    <w:p>
+      <w:pPr>
+        <w:spacing w:after="240"/>
+        <w:rPr>
+          <w:bCs/>
+          <w:i/>
+          <w:iCs/>
+          <w:color w:val="EE0000"/>
+          <w:lang w:val="en-GB"/>
+        </w:rPr>
+      </w:pPr>
+      <w:r>
+        <w:rPr>
+          <w:bCs/>
+          <w:i/>
+          <w:iCs/>
+          <w:color w:val="EE0000"/>
+          <w:lang w:val="en-GB"/>
+        </w:rPr>
+        <w:t>A good section</w:t>
       </w:r>
     </w:p>
     <w:p>
@@ -1862,24 +1444,30 @@
           <w:b/>
           <w:lang w:val="en-GB"/>
         </w:rPr>
-        <w:lastRenderedPageBreak/>
-        <w:t>4 Data preservation, access, and associated timelines</w:t>
-      </w:r>
-    </w:p>
-    <w:p>
-      <w:pPr>
-        <w:spacing w:after="240"/>
-        <w:rPr>
-          <w:b/>
-          <w:lang w:val="en-GB"/>
-        </w:rPr>
-      </w:pPr>
-      <w:r>
-        <w:rPr>
-          <w:b/>
-          <w:lang w:val="en-GB"/>
-        </w:rPr>
-        <w:t>4.1 Repositories</w:t>
+        <w:t>3 Data storage</w:t>
+      </w:r>
+    </w:p>
+    <w:p>
+      <w:pPr>
+        <w:spacing w:after="240"/>
+        <w:rPr>
+          <w:b/>
+          <w:lang w:val="en-GB"/>
+        </w:rPr>
+      </w:pPr>
+      <w:r>
+        <w:rPr>
+          <w:b/>
+          <w:lang w:val="en-GB"/>
+        </w:rPr>
+        <w:t>3</w:t>
+      </w:r>
+      <w:r>
+        <w:rPr>
+          <w:b/>
+          <w:lang w:val="en-GB"/>
+        </w:rPr>
+        <w:t>.1 Repositories</w:t>
       </w:r>
     </w:p>
     <w:p>
@@ -1900,57 +1488,17 @@
           <w:bCs/>
           <w:lang w:val="en-GB"/>
         </w:rPr>
-        <w:t xml:space="preserve">Zenodo: </w:t>
-      </w:r>
-      <w:r>
-        <w:rPr>
-          <w:bCs/>
-          <w:lang w:val="en-GB"/>
-        </w:rPr>
-        <w:t xml:space="preserve">will be </w:t>
-      </w:r>
-      <w:r>
-        <w:rPr>
-          <w:bCs/>
-          <w:lang w:val="en-GB"/>
-        </w:rPr>
-        <w:t xml:space="preserve">the standard choice for data archiving, particularly data </w:t>
-      </w:r>
-      <w:r>
-        <w:rPr>
-          <w:bCs/>
-          <w:lang w:val="en-GB"/>
-        </w:rPr>
-        <w:t>associated with</w:t>
-      </w:r>
-      <w:r>
-        <w:rPr>
-          <w:bCs/>
-          <w:lang w:val="en-GB"/>
-        </w:rPr>
-        <w:t xml:space="preserve"> 1.1.1</w:t>
-      </w:r>
-      <w:r>
-        <w:rPr>
-          <w:bCs/>
-          <w:lang w:val="en-GB"/>
-        </w:rPr>
-        <w:t xml:space="preserve"> and</w:t>
-      </w:r>
-      <w:r>
-        <w:rPr>
-          <w:bCs/>
-          <w:lang w:val="en-GB"/>
-        </w:rPr>
-        <w:t xml:space="preserve"> 1.1.6</w:t>
-      </w:r>
-      <w:r>
-        <w:rPr>
-          <w:bCs/>
-          <w:lang w:val="en-GB"/>
-        </w:rPr>
-        <w:t>—</w:t>
-      </w:r>
+        <w:t xml:space="preserve">Data will be archived on </w:t>
+      </w:r>
+      <w:proofErr w:type="spellStart"/>
+      <w:r>
+        <w:rPr>
+          <w:bCs/>
+          <w:lang w:val="en-GB"/>
+        </w:rPr>
+        <w:t>Zenodo</w:t>
+      </w:r>
+      <w:proofErr w:type="spellEnd"/>
       <w:r>
         <w:rPr>
           <w:bCs/>
@@ -1963,81 +1511,28 @@
           <w:bCs/>
           <w:lang w:val="en-GB"/>
         </w:rPr>
-        <w:t>9</w:t>
-      </w:r>
-      <w:r>
-        <w:rPr>
-          <w:bCs/>
-          <w:lang w:val="en-GB"/>
-        </w:rPr>
-        <w:t>, potentially also 1.1.3</w:t>
-      </w:r>
-      <w:r>
-        <w:rPr>
-          <w:bCs/>
-          <w:lang w:val="en-GB"/>
-        </w:rPr>
-        <w:t>. Most likely a new repository project will be created for each publication due to capacity limitations, but they will be clearly linked within the READMEs to the overall project.</w:t>
-      </w:r>
-      <w:r>
-        <w:rPr>
-          <w:bCs/>
-          <w:lang w:val="en-GB"/>
-        </w:rPr>
-        <w:t xml:space="preserve"> A Zenodo Community will also be created </w:t>
-      </w:r>
-      <w:r>
-        <w:rPr>
-          <w:bCs/>
-          <w:lang w:val="en-GB"/>
-        </w:rPr>
-        <w:t xml:space="preserve">for the RECO-ECO project </w:t>
-      </w:r>
-      <w:r>
-        <w:rPr>
-          <w:bCs/>
-          <w:lang w:val="en-GB"/>
-        </w:rPr>
-        <w:t xml:space="preserve">that contains </w:t>
-      </w:r>
-      <w:proofErr w:type="gramStart"/>
-      <w:r>
-        <w:rPr>
-          <w:bCs/>
-          <w:lang w:val="en-GB"/>
-        </w:rPr>
-        <w:t>all of</w:t>
-      </w:r>
-      <w:proofErr w:type="gramEnd"/>
-      <w:r>
-        <w:rPr>
-          <w:bCs/>
-          <w:lang w:val="en-GB"/>
-        </w:rPr>
-        <w:t xml:space="preserve"> the </w:t>
-      </w:r>
-      <w:r>
-        <w:rPr>
-          <w:bCs/>
-          <w:lang w:val="en-GB"/>
-        </w:rPr>
-        <w:t xml:space="preserve">project outputs that are archived on Zenodo </w:t>
-      </w:r>
-      <w:proofErr w:type="gramStart"/>
-      <w:r>
-        <w:rPr>
-          <w:bCs/>
-          <w:lang w:val="en-GB"/>
-        </w:rPr>
-        <w:t>and also</w:t>
-      </w:r>
-      <w:proofErr w:type="gramEnd"/>
-      <w:r>
-        <w:rPr>
-          <w:bCs/>
-          <w:lang w:val="en-GB"/>
-        </w:rPr>
-        <w:t xml:space="preserve"> links to any externally stored data, ensuring all data outputs are easily traceable.</w:t>
+        <w:t xml:space="preserve"> A Community will be created for </w:t>
+      </w:r>
+      <w:r>
+        <w:rPr>
+          <w:bCs/>
+          <w:lang w:val="en-GB"/>
+        </w:rPr>
+        <w:t xml:space="preserve">the </w:t>
+      </w:r>
+      <w:r>
+        <w:rPr>
+          <w:bCs/>
+          <w:lang w:val="en-GB"/>
+        </w:rPr>
+        <w:t>project that contains all data uploads.</w:t>
+      </w:r>
+      <w:r>
+        <w:rPr>
+          <w:bCs/>
+          <w:lang w:val="en-GB"/>
+        </w:rPr>
+        <w:t xml:space="preserve"> </w:t>
       </w:r>
     </w:p>
     <w:p>
@@ -2053,49 +1548,19 @@
           <w:lang w:val="en-GB"/>
         </w:rPr>
       </w:pPr>
-      <w:proofErr w:type="spellStart"/>
-      <w:r>
-        <w:rPr>
-          <w:bCs/>
-          <w:lang w:val="en-GB"/>
-        </w:rPr>
-        <w:t>MorphoSource</w:t>
-      </w:r>
-      <w:proofErr w:type="spellEnd"/>
-      <w:r>
-        <w:rPr>
-          <w:bCs/>
-          <w:lang w:val="en-GB"/>
-        </w:rPr>
-        <w:t xml:space="preserve">: </w:t>
-      </w:r>
-      <w:r>
-        <w:rPr>
-          <w:bCs/>
-          <w:lang w:val="en-GB"/>
-        </w:rPr>
-        <w:t xml:space="preserve">3D models </w:t>
-      </w:r>
-      <w:r>
-        <w:rPr>
-          <w:bCs/>
-          <w:lang w:val="en-GB"/>
-        </w:rPr>
-        <w:t xml:space="preserve">(1.1.2) </w:t>
-      </w:r>
-      <w:r>
-        <w:rPr>
-          <w:bCs/>
-          <w:lang w:val="en-GB"/>
-        </w:rPr>
-        <w:t xml:space="preserve">will be deposited here, though only those </w:t>
-      </w:r>
-      <w:r>
-        <w:rPr>
-          <w:bCs/>
-          <w:lang w:val="en-GB"/>
-        </w:rPr>
-        <w:t>directly presented within published outputs because free capacity is limited to 100 GB.</w:t>
+      <w:r>
+        <w:rPr>
+          <w:bCs/>
+          <w:lang w:val="en-GB"/>
+        </w:rPr>
+        <w:t>Code will be archived on GitHub</w:t>
+      </w:r>
+      <w:r>
+        <w:rPr>
+          <w:bCs/>
+          <w:lang w:val="en-GB"/>
+        </w:rPr>
+        <w:t>.</w:t>
       </w:r>
     </w:p>
     <w:p>
@@ -2116,160 +1581,6 @@
           <w:bCs/>
           <w:lang w:val="en-GB"/>
         </w:rPr>
-        <w:t>Other online repositories may be used where necessary to make generated data available</w:t>
-      </w:r>
-      <w:r>
-        <w:rPr>
-          <w:bCs/>
-          <w:lang w:val="en-GB"/>
-        </w:rPr>
-        <w:t xml:space="preserve"> (e.g., due to storage capacity limitations).</w:t>
-      </w:r>
-    </w:p>
-    <w:p>
-      <w:pPr>
-        <w:pStyle w:val="ListParagraph"/>
-        <w:numPr>
-          <w:ilvl w:val="0"/>
-          <w:numId w:val="2"/>
-        </w:numPr>
-        <w:spacing w:after="240"/>
-        <w:rPr>
-          <w:b/>
-          <w:lang w:val="en-GB"/>
-        </w:rPr>
-      </w:pPr>
-      <w:r>
-        <w:rPr>
-          <w:bCs/>
-          <w:lang w:val="en-GB"/>
-        </w:rPr>
-        <w:t xml:space="preserve">GitHub: code and other software will </w:t>
-      </w:r>
-      <w:r>
-        <w:rPr>
-          <w:bCs/>
-          <w:lang w:val="en-GB"/>
-        </w:rPr>
-        <w:t xml:space="preserve">be made available </w:t>
-      </w:r>
-      <w:r>
-        <w:rPr>
-          <w:bCs/>
-          <w:lang w:val="en-GB"/>
-        </w:rPr>
-        <w:t>in a dedicated repository on</w:t>
-      </w:r>
-      <w:r>
-        <w:rPr>
-          <w:bCs/>
-          <w:lang w:val="en-GB"/>
-        </w:rPr>
-        <w:t xml:space="preserve"> GitHub, which can be easily associated with data repositories, publications and other outputs as needed.</w:t>
-      </w:r>
-      <w:r>
-        <w:rPr>
-          <w:bCs/>
-          <w:lang w:val="en-GB"/>
-        </w:rPr>
-        <w:t xml:space="preserve"> GitHub repositories can also be released on </w:t>
-      </w:r>
-      <w:r>
-        <w:rPr>
-          <w:bCs/>
-          <w:lang w:val="en-GB"/>
-        </w:rPr>
-        <w:t>Z</w:t>
-      </w:r>
-      <w:r>
-        <w:rPr>
-          <w:bCs/>
-          <w:lang w:val="en-GB"/>
-        </w:rPr>
-        <w:t>enodo, allowing for DOI-linking of software outputs directly</w:t>
-      </w:r>
-      <w:r>
-        <w:rPr>
-          <w:bCs/>
-          <w:lang w:val="en-GB"/>
-        </w:rPr>
-        <w:t xml:space="preserve"> if needed.</w:t>
-      </w:r>
-    </w:p>
-    <w:p>
-      <w:pPr>
-        <w:pStyle w:val="ListParagraph"/>
-        <w:numPr>
-          <w:ilvl w:val="0"/>
-          <w:numId w:val="2"/>
-        </w:numPr>
-        <w:spacing w:after="240"/>
-        <w:rPr>
-          <w:b/>
-          <w:lang w:val="en-GB"/>
-        </w:rPr>
-      </w:pPr>
-      <w:r>
-        <w:rPr>
-          <w:bCs/>
-          <w:lang w:val="en-GB"/>
-        </w:rPr>
-        <w:t>Physical HDD storage: particularly for large files resulting from 1.1.2</w:t>
-      </w:r>
-      <w:r>
-        <w:rPr>
-          <w:bCs/>
-          <w:lang w:val="en-GB"/>
-        </w:rPr>
-        <w:t xml:space="preserve">, </w:t>
-      </w:r>
-      <w:r>
-        <w:rPr>
-          <w:bCs/>
-          <w:lang w:val="en-GB"/>
-        </w:rPr>
-        <w:t>1.1.3,</w:t>
-      </w:r>
-      <w:r>
-        <w:rPr>
-          <w:bCs/>
-          <w:lang w:val="en-GB"/>
-        </w:rPr>
-        <w:t xml:space="preserve"> 1.1.7, and 1.1.9</w:t>
-      </w:r>
-      <w:r>
-        <w:rPr>
-          <w:bCs/>
-          <w:lang w:val="en-GB"/>
-        </w:rPr>
-        <w:t xml:space="preserve"> where the data are</w:t>
-      </w:r>
-      <w:r>
-        <w:rPr>
-          <w:bCs/>
-          <w:lang w:val="en-GB"/>
-        </w:rPr>
-        <w:t xml:space="preserve"> not directly presented in a publication.</w:t>
-      </w:r>
-    </w:p>
-    <w:p>
-      <w:pPr>
-        <w:pStyle w:val="ListParagraph"/>
-        <w:numPr>
-          <w:ilvl w:val="0"/>
-          <w:numId w:val="2"/>
-        </w:numPr>
-        <w:spacing w:after="240"/>
-        <w:rPr>
-          <w:b/>
-          <w:lang w:val="en-GB"/>
-        </w:rPr>
-      </w:pPr>
-      <w:r>
-        <w:rPr>
-          <w:bCs/>
-          <w:lang w:val="en-GB"/>
-        </w:rPr>
         <w:t xml:space="preserve">All repositories and the data stored within will confirm to FAIR standards, and data repositories used will always be non-profit organisations. </w:t>
       </w:r>
     </w:p>
@@ -2277,16 +1588,96 @@
       <w:pPr>
         <w:spacing w:after="240"/>
         <w:rPr>
-          <w:b/>
-          <w:lang w:val="en-GB"/>
-        </w:rPr>
-      </w:pPr>
-      <w:r>
-        <w:rPr>
-          <w:b/>
-          <w:lang w:val="en-GB"/>
-        </w:rPr>
-        <w:t xml:space="preserve">4.2 Data </w:t>
+          <w:bCs/>
+          <w:i/>
+          <w:iCs/>
+          <w:color w:val="EE0000"/>
+          <w:lang w:val="en-GB"/>
+        </w:rPr>
+      </w:pPr>
+      <w:r>
+        <w:rPr>
+          <w:bCs/>
+          <w:i/>
+          <w:iCs/>
+          <w:color w:val="EE0000"/>
+          <w:lang w:val="en-GB"/>
+        </w:rPr>
+        <w:lastRenderedPageBreak/>
+        <w:t>M</w:t>
+      </w:r>
+      <w:r>
+        <w:rPr>
+          <w:bCs/>
+          <w:i/>
+          <w:iCs/>
+          <w:color w:val="EE0000"/>
+          <w:lang w:val="en-GB"/>
+        </w:rPr>
+        <w:t>ore detail on why these</w:t>
+      </w:r>
+      <w:r>
+        <w:rPr>
+          <w:bCs/>
+          <w:i/>
+          <w:iCs/>
+          <w:color w:val="EE0000"/>
+          <w:lang w:val="en-GB"/>
+        </w:rPr>
+        <w:t xml:space="preserve"> repository</w:t>
+      </w:r>
+      <w:r>
+        <w:rPr>
+          <w:bCs/>
+          <w:i/>
+          <w:iCs/>
+          <w:color w:val="EE0000"/>
+          <w:lang w:val="en-GB"/>
+        </w:rPr>
+        <w:t xml:space="preserve"> choices, backup plans if files are too large, local storage plans</w:t>
+      </w:r>
+      <w:r>
+        <w:rPr>
+          <w:bCs/>
+          <w:i/>
+          <w:iCs/>
+          <w:color w:val="EE0000"/>
+          <w:lang w:val="en-GB"/>
+        </w:rPr>
+        <w:t>, when in the research process data will be stored in repositories</w:t>
+      </w:r>
+      <w:r>
+        <w:rPr>
+          <w:bCs/>
+          <w:i/>
+          <w:iCs/>
+          <w:color w:val="EE0000"/>
+          <w:lang w:val="en-GB"/>
+        </w:rPr>
+        <w:t>…</w:t>
+      </w:r>
+    </w:p>
+    <w:p>
+      <w:pPr>
+        <w:spacing w:after="240"/>
+        <w:rPr>
+          <w:b/>
+          <w:lang w:val="en-GB"/>
+        </w:rPr>
+      </w:pPr>
+      <w:r>
+        <w:rPr>
+          <w:b/>
+          <w:lang w:val="en-GB"/>
+        </w:rPr>
+        <w:t>3</w:t>
+      </w:r>
+      <w:r>
+        <w:rPr>
+          <w:b/>
+          <w:lang w:val="en-GB"/>
+        </w:rPr>
+        <w:t xml:space="preserve">.2 Data </w:t>
       </w:r>
       <w:r>
         <w:rPr>
@@ -2335,48 +1726,14 @@
           <w:bCs/>
           <w:lang w:val="en-GB"/>
         </w:rPr>
-        <w:t>where possible to increase accessibility (e.g., .csv, .txt</w:t>
-      </w:r>
-      <w:proofErr w:type="gramStart"/>
-      <w:r>
-        <w:rPr>
-          <w:bCs/>
-          <w:lang w:val="en-GB"/>
-        </w:rPr>
-        <w:t>, .</w:t>
-      </w:r>
-      <w:proofErr w:type="spellStart"/>
-      <w:r>
-        <w:rPr>
-          <w:bCs/>
-          <w:lang w:val="en-GB"/>
-        </w:rPr>
-        <w:t>stl</w:t>
-      </w:r>
-      <w:proofErr w:type="spellEnd"/>
-      <w:proofErr w:type="gramEnd"/>
-      <w:r>
-        <w:rPr>
-          <w:bCs/>
-          <w:lang w:val="en-GB"/>
-        </w:rPr>
-        <w:t>, .</w:t>
-      </w:r>
-      <w:proofErr w:type="spellStart"/>
-      <w:r>
-        <w:rPr>
-          <w:bCs/>
-          <w:lang w:val="en-GB"/>
-        </w:rPr>
-        <w:t>obj</w:t>
-      </w:r>
-      <w:proofErr w:type="spellEnd"/>
-      <w:r>
-        <w:rPr>
-          <w:bCs/>
-          <w:lang w:val="en-GB"/>
-        </w:rPr>
-        <w:t>).</w:t>
+        <w:t>where possible</w:t>
+      </w:r>
+      <w:r>
+        <w:rPr>
+          <w:bCs/>
+          <w:lang w:val="en-GB"/>
+        </w:rPr>
+        <w:t>.</w:t>
       </w:r>
     </w:p>
     <w:p>
@@ -2411,123 +1768,58 @@
           <w:bCs/>
           <w:lang w:val="en-GB"/>
         </w:rPr>
-        <w:t xml:space="preserve">will be DOI-linked </w:t>
-      </w:r>
-      <w:r>
-        <w:rPr>
-          <w:bCs/>
-          <w:lang w:val="en-GB"/>
-        </w:rPr>
-        <w:t xml:space="preserve">(at the time of </w:t>
+        <w:t>will be DOI-linked</w:t>
+      </w:r>
+      <w:r>
+        <w:rPr>
+          <w:bCs/>
+          <w:lang w:val="en-GB"/>
+        </w:rPr>
+        <w:t>.</w:t>
+      </w:r>
+    </w:p>
+    <w:p>
+      <w:pPr>
+        <w:pStyle w:val="ListParagraph"/>
+        <w:spacing w:after="240"/>
+        <w:rPr>
+          <w:bCs/>
+          <w:i/>
+          <w:iCs/>
+          <w:lang w:val="en-GB"/>
+        </w:rPr>
+      </w:pPr>
+      <w:r>
+        <w:rPr>
+          <w:bCs/>
+          <w:i/>
+          <w:iCs/>
+          <w:color w:val="EE0000"/>
+          <w:lang w:val="en-GB"/>
+        </w:rPr>
+        <w:t xml:space="preserve">Could detail that GitHub code will be released on </w:t>
       </w:r>
       <w:proofErr w:type="spellStart"/>
       <w:r>
         <w:rPr>
           <w:bCs/>
-          <w:lang w:val="en-GB"/>
-        </w:rPr>
-        <w:t>preprinting</w:t>
+          <w:i/>
+          <w:iCs/>
+          <w:color w:val="EE0000"/>
+          <w:lang w:val="en-GB"/>
+        </w:rPr>
+        <w:t>Zenodo</w:t>
       </w:r>
       <w:proofErr w:type="spellEnd"/>
       <w:r>
         <w:rPr>
           <w:bCs/>
-          <w:lang w:val="en-GB"/>
-        </w:rPr>
-        <w:t xml:space="preserve"> of the relevant manuscript, or before) </w:t>
-      </w:r>
-      <w:r>
-        <w:rPr>
-          <w:bCs/>
-          <w:lang w:val="en-GB"/>
-        </w:rPr>
-        <w:t xml:space="preserve">so that they are easily findable and citeable. This is a key reason for choosing </w:t>
-      </w:r>
-      <w:r>
-        <w:rPr>
-          <w:bCs/>
-          <w:lang w:val="en-GB"/>
-        </w:rPr>
-        <w:t>Z</w:t>
-      </w:r>
-      <w:r>
-        <w:rPr>
-          <w:bCs/>
-          <w:lang w:val="en-GB"/>
-        </w:rPr>
-        <w:t xml:space="preserve">enodo as the main repository for data, and GitHub as the main repository for </w:t>
-      </w:r>
-      <w:r>
-        <w:rPr>
-          <w:bCs/>
-          <w:lang w:val="en-GB"/>
-        </w:rPr>
-        <w:t>code</w:t>
-      </w:r>
-      <w:r>
-        <w:rPr>
-          <w:bCs/>
-          <w:lang w:val="en-GB"/>
-        </w:rPr>
-        <w:t xml:space="preserve"> (which will be released on Zenodo to allow for DOI-generation)</w:t>
-      </w:r>
-      <w:r>
-        <w:rPr>
-          <w:bCs/>
-          <w:lang w:val="en-GB"/>
-        </w:rPr>
-        <w:t>. Where data uploads are not automatically DOI-linked</w:t>
-      </w:r>
-      <w:r>
-        <w:rPr>
-          <w:bCs/>
-          <w:lang w:val="en-GB"/>
-        </w:rPr>
-        <w:t xml:space="preserve"> (e.g., 1.1.2</w:t>
-      </w:r>
-      <w:r>
-        <w:rPr>
-          <w:bCs/>
-          <w:lang w:val="en-GB"/>
-        </w:rPr>
-        <w:t xml:space="preserve"> on </w:t>
-      </w:r>
-      <w:proofErr w:type="spellStart"/>
-      <w:r>
-        <w:rPr>
-          <w:bCs/>
-          <w:lang w:val="en-GB"/>
-        </w:rPr>
-        <w:t>MorphoSource</w:t>
-      </w:r>
-      <w:proofErr w:type="spellEnd"/>
-      <w:r>
-        <w:rPr>
-          <w:bCs/>
-          <w:lang w:val="en-GB"/>
-        </w:rPr>
-        <w:t>), these will be clearly associated with publications that do have a DOI.</w:t>
-      </w:r>
-    </w:p>
-    <w:p>
-      <w:pPr>
-        <w:pStyle w:val="ListParagraph"/>
-        <w:numPr>
-          <w:ilvl w:val="1"/>
-          <w:numId w:val="8"/>
-        </w:numPr>
-        <w:spacing w:after="240"/>
-        <w:rPr>
-          <w:bCs/>
-          <w:lang w:val="en-GB"/>
-        </w:rPr>
-      </w:pPr>
-      <w:r>
-        <w:rPr>
-          <w:bCs/>
-          <w:lang w:val="en-GB"/>
-        </w:rPr>
-        <w:t>DOI-linking of data and code outputs mean that they can be cited in publications under the project and by others. This also ensures that the metadata will be publicly searchable.</w:t>
+          <w:i/>
+          <w:iCs/>
+          <w:color w:val="EE0000"/>
+          <w:lang w:val="en-GB"/>
+        </w:rPr>
+        <w:t xml:space="preserve"> to give DOIs; why DOIs are important</w:t>
       </w:r>
     </w:p>
     <w:p>
@@ -2578,7 +1870,14 @@
           <w:b/>
           <w:lang w:val="en-GB"/>
         </w:rPr>
-        <w:t>4.3 Data preservation timeline</w:t>
+        <w:t>3</w:t>
+      </w:r>
+      <w:r>
+        <w:rPr>
+          <w:b/>
+          <w:lang w:val="en-GB"/>
+        </w:rPr>
+        <w:t>.3 Data preservation timeline</w:t>
       </w:r>
     </w:p>
     <w:p>
@@ -2599,139 +1898,107 @@
           <w:bCs/>
           <w:lang w:val="en-GB"/>
         </w:rPr>
-        <w:t xml:space="preserve">Data stored in online repositories will remain available to other users for as long as the repositories do; this is another key reason for choosing </w:t>
-      </w:r>
-      <w:r>
-        <w:rPr>
-          <w:bCs/>
-          <w:lang w:val="en-GB"/>
-        </w:rPr>
-        <w:t>Z</w:t>
-      </w:r>
-      <w:r>
-        <w:rPr>
-          <w:bCs/>
-          <w:lang w:val="en-GB"/>
-        </w:rPr>
-        <w:t xml:space="preserve">enodo </w:t>
-      </w:r>
-      <w:r>
-        <w:rPr>
-          <w:bCs/>
-          <w:lang w:val="en-GB"/>
-        </w:rPr>
-        <w:t xml:space="preserve">(minimum 20 years) </w:t>
-      </w:r>
-      <w:r>
-        <w:rPr>
-          <w:bCs/>
-          <w:lang w:val="en-GB"/>
-        </w:rPr>
-        <w:t>and GitHub</w:t>
-      </w:r>
-      <w:r>
-        <w:rPr>
-          <w:bCs/>
-          <w:lang w:val="en-GB"/>
-        </w:rPr>
-        <w:t>.</w:t>
+        <w:t>At the least all data generated will be retained for 10 years after the project-end by storage in online repository and local HDD.</w:t>
       </w:r>
     </w:p>
     <w:p>
       <w:pPr>
         <w:pStyle w:val="ListParagraph"/>
-        <w:numPr>
-          <w:ilvl w:val="0"/>
-          <w:numId w:val="9"/>
-        </w:numPr>
-        <w:spacing w:after="240"/>
-        <w:rPr>
-          <w:bCs/>
-          <w:lang w:val="en-GB"/>
-        </w:rPr>
-      </w:pPr>
-      <w:r>
-        <w:rPr>
-          <w:bCs/>
-          <w:lang w:val="en-GB"/>
-        </w:rPr>
-        <w:lastRenderedPageBreak/>
-        <w:t>At the least all data generated will be retained for 10 years after the project-end by storage in online repository and local HDD.</w:t>
-      </w:r>
-    </w:p>
-    <w:p>
-      <w:pPr>
-        <w:pStyle w:val="ListParagraph"/>
-        <w:numPr>
-          <w:ilvl w:val="0"/>
-          <w:numId w:val="9"/>
-        </w:numPr>
-        <w:spacing w:after="240"/>
-        <w:rPr>
-          <w:bCs/>
-          <w:lang w:val="en-GB"/>
-        </w:rPr>
-      </w:pPr>
-      <w:r>
-        <w:rPr>
-          <w:bCs/>
-          <w:lang w:val="en-GB"/>
-        </w:rPr>
-        <w:t xml:space="preserve">Locally stored data (i.e., those in the process of being generated and used prior to sharing) will be backed up </w:t>
-      </w:r>
-      <w:r>
-        <w:rPr>
-          <w:bCs/>
-          <w:lang w:val="en-GB"/>
-        </w:rPr>
-        <w:t>on the UNIGE NAS servers (</w:t>
-      </w:r>
-      <w:r>
-        <w:rPr>
-          <w:bCs/>
-          <w:lang w:val="en-GB"/>
-        </w:rPr>
-        <w:t>https://catalogue-si.unige.ch/en/stockage-recherche</w:t>
-      </w:r>
-      <w:r>
-        <w:rPr>
-          <w:bCs/>
-          <w:lang w:val="en-GB"/>
-        </w:rPr>
-        <w:t>).</w:t>
-      </w:r>
-    </w:p>
-    <w:p>
-      <w:pPr>
-        <w:shd w:val="clear" w:color="auto" w:fill="C1E4F5" w:themeFill="accent1" w:themeFillTint="33"/>
-        <w:spacing w:after="240"/>
-        <w:rPr>
-          <w:b/>
-          <w:lang w:val="en-GB"/>
-        </w:rPr>
-      </w:pPr>
-      <w:r>
-        <w:rPr>
-          <w:b/>
-          <w:lang w:val="en-GB"/>
-        </w:rPr>
-        <w:t>5 Access, distribution, or reuse considerations</w:t>
-      </w:r>
-    </w:p>
-    <w:p>
-      <w:pPr>
-        <w:spacing w:after="240"/>
-        <w:rPr>
-          <w:b/>
-          <w:lang w:val="en-GB"/>
-        </w:rPr>
-      </w:pPr>
-      <w:r>
-        <w:rPr>
-          <w:b/>
-          <w:lang w:val="en-GB"/>
-        </w:rPr>
-        <w:t>5.1 Licensing</w:t>
+        <w:spacing w:after="240"/>
+        <w:rPr>
+          <w:bCs/>
+          <w:i/>
+          <w:iCs/>
+          <w:lang w:val="en-GB"/>
+        </w:rPr>
+      </w:pPr>
+      <w:r>
+        <w:rPr>
+          <w:bCs/>
+          <w:i/>
+          <w:iCs/>
+          <w:color w:val="EE0000"/>
+          <w:lang w:val="en-GB"/>
+        </w:rPr>
+        <w:t xml:space="preserve">Could locally </w:t>
+      </w:r>
+      <w:proofErr w:type="spellStart"/>
+      <w:r>
+        <w:rPr>
+          <w:bCs/>
+          <w:i/>
+          <w:iCs/>
+          <w:color w:val="EE0000"/>
+          <w:lang w:val="en-GB"/>
+        </w:rPr>
+        <w:t>stored</w:t>
+      </w:r>
+      <w:proofErr w:type="spellEnd"/>
+      <w:r>
+        <w:rPr>
+          <w:bCs/>
+          <w:i/>
+          <w:iCs/>
+          <w:color w:val="EE0000"/>
+          <w:lang w:val="en-GB"/>
+        </w:rPr>
+        <w:t xml:space="preserve"> data be backed up on an institutional server or similar?</w:t>
+      </w:r>
+      <w:r>
+        <w:rPr>
+          <w:bCs/>
+          <w:i/>
+          <w:iCs/>
+          <w:color w:val="EE0000"/>
+          <w:lang w:val="en-GB"/>
+        </w:rPr>
+        <w:br/>
+        <w:t xml:space="preserve">Always check repository retention time – </w:t>
+      </w:r>
+      <w:proofErr w:type="spellStart"/>
+      <w:r>
+        <w:rPr>
+          <w:bCs/>
+          <w:i/>
+          <w:iCs/>
+          <w:color w:val="EE0000"/>
+          <w:lang w:val="en-GB"/>
+        </w:rPr>
+        <w:t>Zenodo</w:t>
+      </w:r>
+      <w:proofErr w:type="spellEnd"/>
+      <w:r>
+        <w:rPr>
+          <w:bCs/>
+          <w:i/>
+          <w:iCs/>
+          <w:color w:val="EE0000"/>
+          <w:lang w:val="en-GB"/>
+        </w:rPr>
+        <w:t xml:space="preserve"> at least 20 years</w:t>
+      </w:r>
+    </w:p>
+    <w:p>
+      <w:pPr>
+        <w:spacing w:after="240"/>
+        <w:rPr>
+          <w:b/>
+          <w:lang w:val="en-GB"/>
+        </w:rPr>
+      </w:pPr>
+      <w:r>
+        <w:rPr>
+          <w:b/>
+          <w:lang w:val="en-GB"/>
+        </w:rPr>
+        <w:t>3.4</w:t>
+      </w:r>
+      <w:r>
+        <w:rPr>
+          <w:b/>
+          <w:lang w:val="en-GB"/>
+        </w:rPr>
+        <w:t xml:space="preserve"> Licensing</w:t>
       </w:r>
       <w:r>
         <w:rPr>
@@ -2759,7 +2026,79 @@
           <w:bCs/>
           <w:lang w:val="en-GB"/>
         </w:rPr>
-        <w:t>No factors are foreseen restricting access to, distribution, or reuse of generated data once published (though see 5.2).</w:t>
+        <w:t>Data will generally be licensed as</w:t>
+      </w:r>
+      <w:r>
+        <w:rPr>
+          <w:bCs/>
+          <w:lang w:val="en-GB"/>
+        </w:rPr>
+        <w:t xml:space="preserve"> CC-BY: allowing reuse, modification, distribution, etc., with attribution.</w:t>
+      </w:r>
+    </w:p>
+    <w:p>
+      <w:pPr>
+        <w:spacing w:after="240"/>
+        <w:rPr>
+          <w:bCs/>
+          <w:i/>
+          <w:iCs/>
+          <w:lang w:val="en-GB"/>
+        </w:rPr>
+      </w:pPr>
+      <w:r>
+        <w:rPr>
+          <w:bCs/>
+          <w:i/>
+          <w:iCs/>
+          <w:color w:val="EE0000"/>
+          <w:lang w:val="en-GB"/>
+        </w:rPr>
+        <w:t>Who will the data ultimately be owned by? Check your institutional/funder policies</w:t>
+      </w:r>
+      <w:r>
+        <w:rPr>
+          <w:bCs/>
+          <w:i/>
+          <w:iCs/>
+          <w:color w:val="EE0000"/>
+          <w:lang w:val="en-GB"/>
+        </w:rPr>
+        <w:br/>
+      </w:r>
+      <w:r>
+        <w:rPr>
+          <w:bCs/>
+          <w:i/>
+          <w:iCs/>
+          <w:color w:val="EE0000"/>
+          <w:lang w:val="en-GB"/>
+        </w:rPr>
+        <w:t>Include how you will handle potential embargo periods</w:t>
+      </w:r>
+    </w:p>
+    <w:p>
+      <w:pPr>
+        <w:shd w:val="clear" w:color="auto" w:fill="C1E4F5" w:themeFill="accent1" w:themeFillTint="33"/>
+        <w:spacing w:after="240"/>
+        <w:rPr>
+          <w:b/>
+          <w:lang w:val="en-GB"/>
+        </w:rPr>
+      </w:pPr>
+      <w:r>
+        <w:rPr>
+          <w:b/>
+          <w:lang w:val="en-GB"/>
+        </w:rPr>
+        <w:t>4</w:t>
+      </w:r>
+      <w:r>
+        <w:rPr>
+          <w:b/>
+          <w:lang w:val="en-GB"/>
+        </w:rPr>
+        <w:t xml:space="preserve"> Ethics, legal, and security issues</w:t>
       </w:r>
     </w:p>
     <w:p>
@@ -2767,7 +2106,7 @@
         <w:pStyle w:val="ListParagraph"/>
         <w:numPr>
           <w:ilvl w:val="0"/>
-          <w:numId w:val="10"/>
+          <w:numId w:val="19"/>
         </w:numPr>
         <w:spacing w:after="240"/>
         <w:rPr>
@@ -2780,91 +2119,7 @@
           <w:bCs/>
           <w:lang w:val="en-GB"/>
         </w:rPr>
-        <w:t>Licenses:</w:t>
-      </w:r>
-    </w:p>
-    <w:p>
-      <w:pPr>
-        <w:pStyle w:val="ListParagraph"/>
-        <w:numPr>
-          <w:ilvl w:val="1"/>
-          <w:numId w:val="10"/>
-        </w:numPr>
-        <w:spacing w:after="240"/>
-        <w:rPr>
-          <w:bCs/>
-          <w:lang w:val="en-GB"/>
-        </w:rPr>
-      </w:pPr>
-      <w:r>
-        <w:rPr>
-          <w:bCs/>
-          <w:lang w:val="en-GB"/>
-        </w:rPr>
-        <w:t>Data will generally be licensed as</w:t>
-      </w:r>
-      <w:r>
-        <w:rPr>
-          <w:bCs/>
-          <w:lang w:val="en-GB"/>
-        </w:rPr>
-        <w:t xml:space="preserve"> CC-BY: allowing reuse, modification, distribution, etc., with attribution.</w:t>
-      </w:r>
-    </w:p>
-    <w:p>
-      <w:pPr>
-        <w:pStyle w:val="ListParagraph"/>
-        <w:numPr>
-          <w:ilvl w:val="1"/>
-          <w:numId w:val="10"/>
-        </w:numPr>
-        <w:spacing w:after="240"/>
-        <w:rPr>
-          <w:bCs/>
-          <w:lang w:val="en-GB"/>
-        </w:rPr>
-      </w:pPr>
-      <w:r>
-        <w:rPr>
-          <w:bCs/>
-          <w:lang w:val="en-GB"/>
-        </w:rPr>
-        <w:t>Code will generally be licensed as</w:t>
-      </w:r>
-      <w:r>
-        <w:rPr>
-          <w:bCs/>
-          <w:lang w:val="en-GB"/>
-        </w:rPr>
-        <w:t xml:space="preserve"> GNU</w:t>
-      </w:r>
-      <w:r>
-        <w:rPr>
-          <w:bCs/>
-          <w:lang w:val="en-GB"/>
-        </w:rPr>
-        <w:t xml:space="preserve"> General Public License</w:t>
-      </w:r>
-      <w:r>
-        <w:rPr>
-          <w:bCs/>
-          <w:lang w:val="en-GB"/>
-        </w:rPr>
-        <w:t xml:space="preserve">: </w:t>
-      </w:r>
-      <w:r>
-        <w:rPr>
-          <w:bCs/>
-          <w:lang w:val="en-GB"/>
-        </w:rPr>
-        <w:t xml:space="preserve">copyleft, meaning </w:t>
-      </w:r>
-      <w:r>
-        <w:rPr>
-          <w:bCs/>
-          <w:lang w:val="en-GB"/>
-        </w:rPr>
-        <w:t>it allows use, modification, distribution etc., with attribution, and requiring derivatives to have the same licensing terms.</w:t>
+        <w:t>No data will be generated that is confidential, personal or sensitive.</w:t>
       </w:r>
     </w:p>
     <w:p>
@@ -2872,7 +2127,7 @@
         <w:pStyle w:val="ListParagraph"/>
         <w:numPr>
           <w:ilvl w:val="0"/>
-          <w:numId w:val="10"/>
+          <w:numId w:val="19"/>
         </w:numPr>
         <w:spacing w:after="240"/>
         <w:rPr>
@@ -2885,100 +2140,28 @@
           <w:bCs/>
           <w:lang w:val="en-GB"/>
         </w:rPr>
-        <w:t xml:space="preserve">Data generated for this project </w:t>
-      </w:r>
-      <w:r>
-        <w:rPr>
-          <w:bCs/>
-          <w:lang w:val="en-GB"/>
-        </w:rPr>
-        <w:t>during</w:t>
-      </w:r>
-      <w:r>
-        <w:rPr>
-          <w:bCs/>
-          <w:lang w:val="en-GB"/>
-        </w:rPr>
-        <w:t xml:space="preserve"> the project by the author or salaried group members are owned by UNIGE, though managed by the author.</w:t>
-      </w:r>
-    </w:p>
-    <w:p>
-      <w:pPr>
-        <w:spacing w:after="240"/>
-        <w:rPr>
-          <w:b/>
-          <w:lang w:val="en-GB"/>
-        </w:rPr>
-      </w:pPr>
-      <w:r>
-        <w:rPr>
-          <w:b/>
-          <w:lang w:val="en-GB"/>
-        </w:rPr>
-        <w:t>5.2 Embargoing</w:t>
-      </w:r>
-    </w:p>
-    <w:p>
-      <w:pPr>
-        <w:pStyle w:val="ListParagraph"/>
-        <w:numPr>
-          <w:ilvl w:val="0"/>
-          <w:numId w:val="11"/>
-        </w:numPr>
-        <w:spacing w:after="240"/>
-        <w:rPr>
-          <w:bCs/>
-          <w:lang w:val="en-GB"/>
-        </w:rPr>
-      </w:pPr>
-      <w:r>
-        <w:rPr>
-          <w:bCs/>
-          <w:lang w:val="en-GB"/>
-        </w:rPr>
-        <w:t>Embargoes may be applied to generated data related to publications, where necessary</w:t>
-      </w:r>
-      <w:r>
-        <w:rPr>
-          <w:bCs/>
-          <w:lang w:val="en-GB"/>
-        </w:rPr>
-        <w:t xml:space="preserve"> according to the journal of publication</w:t>
-      </w:r>
-      <w:r>
-        <w:rPr>
-          <w:bCs/>
-          <w:lang w:val="en-GB"/>
-        </w:rPr>
-        <w:t>. Zenodo allows for data repository embargo periods</w:t>
-      </w:r>
-      <w:r>
-        <w:rPr>
-          <w:bCs/>
-          <w:lang w:val="en-GB"/>
-        </w:rPr>
-        <w:t>, and these will be lifted as soon as possible.</w:t>
-      </w:r>
-    </w:p>
-    <w:p>
-      <w:pPr>
-        <w:pStyle w:val="ListParagraph"/>
-        <w:numPr>
-          <w:ilvl w:val="0"/>
-          <w:numId w:val="11"/>
-        </w:numPr>
-        <w:spacing w:after="240"/>
-        <w:rPr>
-          <w:bCs/>
-          <w:lang w:val="en-GB"/>
-        </w:rPr>
-      </w:pPr>
-      <w:r>
-        <w:rPr>
-          <w:bCs/>
-          <w:lang w:val="en-GB"/>
-        </w:rPr>
-        <w:t>Any data or code/software restricted in any way other than embargoing will be made public at the time of associated article publication.</w:t>
+        <w:t>The data generated pose a low security risk.</w:t>
+      </w:r>
+    </w:p>
+    <w:p>
+      <w:pPr>
+        <w:spacing w:after="240"/>
+        <w:rPr>
+          <w:bCs/>
+          <w:i/>
+          <w:iCs/>
+          <w:lang w:val="en-GB"/>
+        </w:rPr>
+      </w:pPr>
+      <w:r>
+        <w:rPr>
+          <w:bCs/>
+          <w:i/>
+          <w:iCs/>
+          <w:color w:val="EE0000"/>
+          <w:lang w:val="en-GB"/>
+        </w:rPr>
+        <w:t>Need to add about museum specimens, as these are discussed in section 1: e.g., potential for sensitive metadata, discuss data sharing with curators in advance</w:t>
       </w:r>
     </w:p>
     <w:p>
@@ -2995,227 +2178,7 @@
           <w:b/>
           <w:lang w:val="en-GB"/>
         </w:rPr>
-        <w:t>6 Ethics, legal, and security issues</w:t>
-      </w:r>
-    </w:p>
-    <w:p>
-      <w:pPr>
-        <w:spacing w:after="240"/>
-        <w:rPr>
-          <w:b/>
-          <w:lang w:val="en-GB"/>
-        </w:rPr>
-      </w:pPr>
-      <w:r>
-        <w:rPr>
-          <w:b/>
-          <w:lang w:val="en-GB"/>
-        </w:rPr>
-        <w:t>6.1 Ethical issues</w:t>
-      </w:r>
-    </w:p>
-    <w:p>
-      <w:pPr>
-        <w:pStyle w:val="ListParagraph"/>
-        <w:numPr>
-          <w:ilvl w:val="0"/>
-          <w:numId w:val="12"/>
-        </w:numPr>
-        <w:spacing w:after="240"/>
-        <w:rPr>
-          <w:bCs/>
-          <w:lang w:val="en-GB"/>
-        </w:rPr>
-      </w:pPr>
-      <w:r>
-        <w:rPr>
-          <w:bCs/>
-          <w:lang w:val="en-GB"/>
-        </w:rPr>
-        <w:t xml:space="preserve">The project will not use any data from human subjects or data that is otherwise confidential, personal, or sensitive in nature such that they could require special protection or ethical consideration. The project has already </w:t>
-      </w:r>
-      <w:r>
-        <w:rPr>
-          <w:bCs/>
-          <w:lang w:val="en-GB"/>
-        </w:rPr>
-        <w:t>been confirmed to not require ethical approval.</w:t>
-      </w:r>
-    </w:p>
-    <w:p>
-      <w:pPr>
-        <w:pStyle w:val="ListParagraph"/>
-        <w:numPr>
-          <w:ilvl w:val="0"/>
-          <w:numId w:val="12"/>
-        </w:numPr>
-        <w:spacing w:after="240"/>
-        <w:rPr>
-          <w:bCs/>
-          <w:lang w:val="en-GB"/>
-        </w:rPr>
-      </w:pPr>
-      <w:r>
-        <w:rPr>
-          <w:bCs/>
-          <w:lang w:val="en-GB"/>
-        </w:rPr>
-        <w:t>Some specimens that will be used to generate data are publicly accessible through museum collections. If aspects of their metadata (e.g., collection locality coordinates) are deliberately hidden by curators to protect a vulnerable fossiliferous location they will not be included in metadata published through this project.</w:t>
-      </w:r>
-      <w:r>
-        <w:rPr>
-          <w:bCs/>
-          <w:lang w:val="en-GB"/>
-        </w:rPr>
-        <w:t xml:space="preserve"> All data collection related to accessioned museum specimens will be discussed with relevant curators in advance.</w:t>
-      </w:r>
-    </w:p>
-    <w:p>
-      <w:pPr>
-        <w:pStyle w:val="ListParagraph"/>
-        <w:numPr>
-          <w:ilvl w:val="0"/>
-          <w:numId w:val="12"/>
-        </w:numPr>
-        <w:spacing w:after="240"/>
-        <w:rPr>
-          <w:bCs/>
-          <w:lang w:val="en-GB"/>
-        </w:rPr>
-      </w:pPr>
-      <w:r>
-        <w:rPr>
-          <w:bCs/>
-          <w:lang w:val="en-GB"/>
-        </w:rPr>
-        <w:t>Fossil collecting permits (for 1.1.8) will be obtained prior to collecting specimens during field work. Permit approval and field work will be done in concert with local collaborators that regularly work in the same sampling regions.</w:t>
-      </w:r>
-      <w:r>
-        <w:rPr>
-          <w:bCs/>
-          <w:lang w:val="en-GB"/>
-        </w:rPr>
-        <w:t xml:space="preserve"> Any fossil material collected will be publicly accessioned in a local collection (likely the </w:t>
-      </w:r>
-      <w:r>
-        <w:rPr>
-          <w:bCs/>
-          <w:lang w:val="en-GB"/>
-        </w:rPr>
-        <w:t xml:space="preserve">Museo </w:t>
-      </w:r>
-      <w:proofErr w:type="spellStart"/>
-      <w:r>
-        <w:rPr>
-          <w:bCs/>
-          <w:lang w:val="en-GB"/>
-        </w:rPr>
-        <w:t>Paleontológico</w:t>
-      </w:r>
-      <w:proofErr w:type="spellEnd"/>
-      <w:r>
-        <w:rPr>
-          <w:bCs/>
-          <w:lang w:val="en-GB"/>
-        </w:rPr>
-        <w:t xml:space="preserve">, </w:t>
-      </w:r>
-      <w:r>
-        <w:rPr>
-          <w:bCs/>
-          <w:lang w:val="en-GB"/>
-        </w:rPr>
-        <w:t xml:space="preserve">University of </w:t>
-      </w:r>
-      <w:r>
-        <w:rPr>
-          <w:bCs/>
-          <w:lang w:val="en-GB"/>
-        </w:rPr>
-        <w:t>Zaragoza, Spain</w:t>
-      </w:r>
-      <w:r>
-        <w:rPr>
-          <w:bCs/>
-          <w:lang w:val="en-GB"/>
-        </w:rPr>
-        <w:t xml:space="preserve"> [MPZ]).</w:t>
-      </w:r>
-    </w:p>
-    <w:p>
-      <w:pPr>
-        <w:spacing w:after="240"/>
-        <w:rPr>
-          <w:b/>
-          <w:lang w:val="en-GB"/>
-        </w:rPr>
-      </w:pPr>
-      <w:r>
-        <w:rPr>
-          <w:b/>
-          <w:lang w:val="en-GB"/>
-        </w:rPr>
-        <w:lastRenderedPageBreak/>
-        <w:t>6.2 Data security</w:t>
-      </w:r>
-    </w:p>
-    <w:p>
-      <w:pPr>
-        <w:pStyle w:val="ListParagraph"/>
-        <w:numPr>
-          <w:ilvl w:val="0"/>
-          <w:numId w:val="13"/>
-        </w:numPr>
-        <w:spacing w:after="240"/>
-        <w:rPr>
-          <w:bCs/>
-          <w:lang w:val="en-GB"/>
-        </w:rPr>
-      </w:pPr>
-      <w:r>
-        <w:rPr>
-          <w:bCs/>
-          <w:lang w:val="en-GB"/>
-        </w:rPr>
-        <w:t>Data generated through the project pose a low security risk as no personal or sensitive data will be collected.</w:t>
-      </w:r>
-    </w:p>
-    <w:p>
-      <w:pPr>
-        <w:pStyle w:val="ListParagraph"/>
-        <w:numPr>
-          <w:ilvl w:val="0"/>
-          <w:numId w:val="13"/>
-        </w:numPr>
-        <w:spacing w:after="240"/>
-        <w:rPr>
-          <w:bCs/>
-          <w:lang w:val="en-GB"/>
-        </w:rPr>
-      </w:pPr>
-      <w:r>
-        <w:rPr>
-          <w:bCs/>
-          <w:lang w:val="en-GB"/>
-        </w:rPr>
-        <w:t>Only secured repositories (e.g., Zenodo) will be used, and the author will manage all repository access herself.</w:t>
-      </w:r>
-    </w:p>
-    <w:p>
-      <w:pPr>
-        <w:shd w:val="clear" w:color="auto" w:fill="C1E4F5" w:themeFill="accent1" w:themeFillTint="33"/>
-        <w:spacing w:after="240"/>
-        <w:rPr>
-          <w:b/>
-          <w:lang w:val="en-GB"/>
-        </w:rPr>
-      </w:pPr>
-      <w:r>
-        <w:rPr>
-          <w:b/>
-          <w:lang w:val="en-GB"/>
-        </w:rPr>
-        <w:t>7</w:t>
+        <w:t>5</w:t>
       </w:r>
       <w:r>
         <w:rPr>
@@ -3238,602 +2201,74 @@
           <w:bCs/>
           <w:lang w:val="en-GB"/>
         </w:rPr>
-        <w:t xml:space="preserve">I, Dr Harriet B. Drage, will be responsible for implementing the DMP, ensuring it is reviewed and revised, and responsible for carrying out its directions. </w:t>
-      </w:r>
-      <w:r>
-        <w:rPr>
-          <w:bCs/>
-          <w:lang w:val="en-GB"/>
-        </w:rPr>
-        <w:t xml:space="preserve">I will also be responsible for preserving the data following the lifetime of the project. </w:t>
-      </w:r>
-      <w:r>
-        <w:rPr>
-          <w:bCs/>
-          <w:lang w:val="en-GB"/>
-        </w:rPr>
-        <w:t xml:space="preserve">My PhD student, and other future students </w:t>
-      </w:r>
-      <w:r>
-        <w:rPr>
-          <w:bCs/>
-          <w:lang w:val="en-GB"/>
-        </w:rPr>
-        <w:t xml:space="preserve">and colleagues </w:t>
-      </w:r>
-      <w:r>
-        <w:rPr>
-          <w:bCs/>
-          <w:lang w:val="en-GB"/>
-        </w:rPr>
-        <w:t xml:space="preserve">collaborating on the project, </w:t>
-      </w:r>
-      <w:r>
-        <w:rPr>
-          <w:bCs/>
-          <w:lang w:val="en-GB"/>
-        </w:rPr>
-        <w:t xml:space="preserve">will also be responsible for generating data. If these data fall under the remit of this </w:t>
-      </w:r>
-      <w:r>
-        <w:rPr>
-          <w:bCs/>
-          <w:lang w:val="en-GB"/>
-        </w:rPr>
-        <w:t>project,</w:t>
-      </w:r>
-      <w:r>
-        <w:rPr>
-          <w:bCs/>
-          <w:lang w:val="en-GB"/>
-        </w:rPr>
-        <w:t xml:space="preserve"> they will be handled and shared in accordance with this DMP</w:t>
-      </w:r>
-      <w:r>
-        <w:rPr>
-          <w:bCs/>
-          <w:lang w:val="en-GB"/>
-        </w:rPr>
-        <w:t>.</w:t>
-      </w:r>
-    </w:p>
-    <w:p>
-      <w:pPr>
-        <w:spacing w:after="240"/>
-        <w:rPr>
-          <w:bCs/>
-          <w:lang w:val="en-GB"/>
-        </w:rPr>
-      </w:pPr>
-      <w:r>
-        <w:rPr>
-          <w:bCs/>
-          <w:lang w:val="en-GB"/>
-        </w:rPr>
-        <w:t xml:space="preserve">In addition to the author, the PhD student (to be updated), master’s and bachelor’s students and interns, and collaborators on the project will have access to some or </w:t>
-      </w:r>
-      <w:proofErr w:type="gramStart"/>
-      <w:r>
-        <w:rPr>
-          <w:bCs/>
-          <w:lang w:val="en-GB"/>
-        </w:rPr>
-        <w:t>all of</w:t>
-      </w:r>
-      <w:proofErr w:type="gramEnd"/>
-      <w:r>
-        <w:rPr>
-          <w:bCs/>
-          <w:lang w:val="en-GB"/>
-        </w:rPr>
-        <w:t xml:space="preserve"> the data generated and reused. However, access will only be given by the author of this document if necessary and raw copies of data will always be retained to ensure no loss occurs. Only the author will have full administrative access to the repositories storing generated data</w:t>
-      </w:r>
-      <w:r>
-        <w:rPr>
-          <w:bCs/>
-          <w:lang w:val="en-GB"/>
-        </w:rPr>
-        <w:t>, and I will oversee all use and storage of data by other users so that it is in-keeping with this DMP.</w:t>
-      </w:r>
-    </w:p>
-    <w:p>
-      <w:pPr>
-        <w:shd w:val="clear" w:color="auto" w:fill="C1E4F5" w:themeFill="accent1" w:themeFillTint="33"/>
-        <w:spacing w:after="240"/>
-        <w:rPr>
-          <w:b/>
-          <w:lang w:val="en-GB"/>
-        </w:rPr>
-      </w:pPr>
-      <w:r>
-        <w:rPr>
-          <w:b/>
-          <w:lang w:val="en-GB"/>
-        </w:rPr>
-        <w:t>8 References and links</w:t>
-      </w:r>
-    </w:p>
-    <w:p>
-      <w:pPr>
-        <w:spacing w:after="240"/>
-        <w:rPr>
-          <w:bCs/>
-          <w:lang w:val="en-GB"/>
-        </w:rPr>
-      </w:pPr>
-      <w:r>
-        <w:rPr>
-          <w:bCs/>
-          <w:lang w:val="en-GB"/>
-        </w:rPr>
-        <w:t xml:space="preserve">Drage, H.B., Pates, S. and Minter, N.J. 2024. Experimental protocol for validation of Computational Fluid Dynamics palaeoecological simulations. </w:t>
-      </w:r>
-      <w:r>
-        <w:rPr>
-          <w:bCs/>
-          <w:i/>
-          <w:iCs/>
-          <w:lang w:val="en-GB"/>
-        </w:rPr>
-        <w:t xml:space="preserve">EcoEvoRxiv </w:t>
-      </w:r>
-      <w:r>
-        <w:rPr>
-          <w:bCs/>
-          <w:lang w:val="en-GB"/>
-        </w:rPr>
-        <w:t xml:space="preserve">preprint. </w:t>
-      </w:r>
-      <w:hyperlink r:id="rId8" w:history="1">
-        <w:r>
-          <w:rPr>
-            <w:rStyle w:val="Hyperlink"/>
-            <w:bCs/>
-            <w:lang w:val="en-GB"/>
-          </w:rPr>
-          <w:t>https://doi.org/10.32942/X28W36</w:t>
-        </w:r>
-      </w:hyperlink>
-      <w:r>
-        <w:rPr>
-          <w:bCs/>
+        <w:t>The author will be responsible for implementing this DMP.</w:t>
+      </w:r>
+    </w:p>
+    <w:p>
+      <w:pPr>
+        <w:spacing w:after="240"/>
+        <w:rPr>
+          <w:bCs/>
+          <w:i/>
+          <w:iCs/>
+          <w:color w:val="EE0000"/>
+          <w:lang w:val="en-GB"/>
+        </w:rPr>
+      </w:pPr>
+      <w:r>
+        <w:rPr>
+          <w:bCs/>
+          <w:i/>
+          <w:iCs/>
+          <w:color w:val="EE0000"/>
+          <w:lang w:val="en-GB"/>
+        </w:rPr>
+        <w:t>A</w:t>
+      </w:r>
+      <w:r>
+        <w:rPr>
+          <w:bCs/>
+          <w:i/>
+          <w:iCs/>
+          <w:color w:val="EE0000"/>
+          <w:lang w:val="en-GB"/>
+        </w:rPr>
+        <w:t>dd some info on who else has access to the data, or management rights (collaborators, students?)</w:t>
+      </w:r>
+      <w:r>
+        <w:rPr>
+          <w:bCs/>
+          <w:i/>
+          <w:iCs/>
+          <w:color w:val="EE0000"/>
           <w:lang w:val="en-GB"/>
         </w:rPr>
         <w:br/>
-        <w:t xml:space="preserve">OSF project with code and data: </w:t>
-      </w:r>
-      <w:hyperlink r:id="rId9" w:history="1">
-        <w:r>
-          <w:rPr>
-            <w:rStyle w:val="Hyperlink"/>
-            <w:bCs/>
-            <w:lang w:val="en-GB"/>
-          </w:rPr>
-          <w:t>https://doi.org/10.17605/OSF.IO/CYW7N</w:t>
-        </w:r>
-      </w:hyperlink>
-      <w:r>
-        <w:rPr>
-          <w:bCs/>
+      </w:r>
+      <w:r>
+        <w:rPr>
+          <w:bCs/>
+          <w:i/>
+          <w:iCs/>
+          <w:color w:val="EE0000"/>
+          <w:lang w:val="en-GB"/>
+        </w:rPr>
+        <w:t>Could add some references and/or links if helpful (to future you!)</w:t>
+      </w:r>
+      <w:r>
+        <w:rPr>
+          <w:bCs/>
+          <w:i/>
+          <w:iCs/>
           <w:lang w:val="en-GB"/>
         </w:rPr>
         <w:t xml:space="preserve"> </w:t>
       </w:r>
     </w:p>
-    <w:p>
-      <w:pPr>
-        <w:spacing w:after="240"/>
-        <w:rPr>
-          <w:bCs/>
-          <w:lang w:val="en-GB"/>
-        </w:rPr>
-      </w:pPr>
-      <w:r>
-        <w:rPr>
-          <w:bCs/>
-          <w:lang w:val="en-GB"/>
-        </w:rPr>
-        <w:t xml:space="preserve">Jones, L.A., </w:t>
-      </w:r>
-      <w:r>
-        <w:rPr>
-          <w:bCs/>
-          <w:lang w:val="en-GB"/>
-        </w:rPr>
-        <w:t xml:space="preserve">Dean, C.D., Allen, B.J., Drage, H.B., Flannery-Sutherland, J.T., Gearty, W., Chiarenza, A.A., Dillon, E.M., Farina, B.M. and Godoy, P.L. 2025. Ten simple rules to follow when cleaning occurrence data in palaeobiology. </w:t>
-      </w:r>
-      <w:r>
-        <w:rPr>
-          <w:bCs/>
-          <w:i/>
-          <w:iCs/>
-          <w:lang w:val="en-GB"/>
-        </w:rPr>
-        <w:t xml:space="preserve">Palaeontology </w:t>
-      </w:r>
-      <w:r>
-        <w:rPr>
-          <w:bCs/>
-          <w:lang w:val="en-GB"/>
-        </w:rPr>
-        <w:t xml:space="preserve">68. </w:t>
-      </w:r>
-      <w:hyperlink r:id="rId10" w:history="1">
-        <w:r>
-          <w:rPr>
-            <w:rStyle w:val="Hyperlink"/>
-            <w:bCs/>
-            <w:lang w:val="en-GB"/>
-          </w:rPr>
-          <w:t>https://doi.org/10.1111/pala.70028</w:t>
-        </w:r>
-      </w:hyperlink>
-      <w:r>
-        <w:rPr>
-          <w:bCs/>
-          <w:lang w:val="en-GB"/>
-        </w:rPr>
-        <w:t xml:space="preserve"> </w:t>
-      </w:r>
-    </w:p>
-    <w:p>
-      <w:pPr>
-        <w:spacing w:after="240"/>
-        <w:rPr>
-          <w:bCs/>
-          <w:lang w:val="en-GB"/>
-        </w:rPr>
-      </w:pPr>
-      <w:r>
-        <w:rPr>
-          <w:bCs/>
-          <w:lang w:val="en-GB"/>
-        </w:rPr>
-        <w:t>Standards:</w:t>
-      </w:r>
-    </w:p>
-    <w:p>
-      <w:pPr>
-        <w:pStyle w:val="ListParagraph"/>
-        <w:numPr>
-          <w:ilvl w:val="0"/>
-          <w:numId w:val="14"/>
-        </w:numPr>
-        <w:spacing w:after="240"/>
-        <w:rPr>
-          <w:bCs/>
-          <w:lang w:val="en-GB"/>
-        </w:rPr>
-      </w:pPr>
-      <w:r>
-        <w:rPr>
-          <w:bCs/>
-          <w:lang w:val="en-GB"/>
-        </w:rPr>
-        <w:t xml:space="preserve">Darwin Core taxonomy: </w:t>
-      </w:r>
-      <w:hyperlink r:id="rId11" w:history="1">
-        <w:r>
-          <w:rPr>
-            <w:rStyle w:val="Hyperlink"/>
-            <w:bCs/>
-            <w:lang w:val="en-GB"/>
-          </w:rPr>
-          <w:t>https://dwc.tdwg.org</w:t>
-        </w:r>
-      </w:hyperlink>
-    </w:p>
-    <w:p>
-      <w:pPr>
-        <w:spacing w:after="240"/>
-        <w:rPr>
-          <w:bCs/>
-          <w:lang w:val="en-GB"/>
-        </w:rPr>
-      </w:pPr>
-      <w:r>
-        <w:rPr>
-          <w:bCs/>
-          <w:lang w:val="en-GB"/>
-        </w:rPr>
-        <w:t>Repositories:</w:t>
-      </w:r>
-    </w:p>
-    <w:p>
-      <w:pPr>
-        <w:pStyle w:val="ListParagraph"/>
-        <w:numPr>
-          <w:ilvl w:val="0"/>
-          <w:numId w:val="14"/>
-        </w:numPr>
-        <w:spacing w:after="240"/>
-        <w:rPr>
-          <w:bCs/>
-          <w:lang w:val="en-GB"/>
-        </w:rPr>
-      </w:pPr>
-      <w:hyperlink r:id="rId12" w:history="1">
-        <w:r>
-          <w:rPr>
-            <w:rStyle w:val="Hyperlink"/>
-            <w:bCs/>
-            <w:lang w:val="en-GB"/>
-          </w:rPr>
-          <w:t>https://zenodo.org</w:t>
-        </w:r>
-      </w:hyperlink>
-      <w:r>
-        <w:rPr>
-          <w:bCs/>
-          <w:lang w:val="en-GB"/>
-        </w:rPr>
-        <w:t xml:space="preserve"> </w:t>
-      </w:r>
-    </w:p>
-    <w:p>
-      <w:pPr>
-        <w:pStyle w:val="ListParagraph"/>
-        <w:numPr>
-          <w:ilvl w:val="0"/>
-          <w:numId w:val="14"/>
-        </w:numPr>
-        <w:spacing w:after="240"/>
-        <w:rPr>
-          <w:bCs/>
-          <w:lang w:val="en-GB"/>
-        </w:rPr>
-      </w:pPr>
-      <w:hyperlink r:id="rId13" w:history="1">
-        <w:r>
-          <w:rPr>
-            <w:rStyle w:val="Hyperlink"/>
-            <w:bCs/>
-            <w:lang w:val="en-GB"/>
-          </w:rPr>
-          <w:t>https://www.morphosource.org</w:t>
-        </w:r>
-      </w:hyperlink>
-      <w:r>
-        <w:rPr>
-          <w:bCs/>
-          <w:lang w:val="en-GB"/>
-        </w:rPr>
-        <w:t xml:space="preserve"> </w:t>
-      </w:r>
-    </w:p>
-    <w:p>
-      <w:pPr>
-        <w:pStyle w:val="ListParagraph"/>
-        <w:numPr>
-          <w:ilvl w:val="0"/>
-          <w:numId w:val="14"/>
-        </w:numPr>
-        <w:spacing w:after="240"/>
-        <w:rPr>
-          <w:bCs/>
-          <w:lang w:val="en-GB"/>
-        </w:rPr>
-      </w:pPr>
-      <w:hyperlink r:id="rId14" w:history="1">
-        <w:r>
-          <w:rPr>
-            <w:rStyle w:val="Hyperlink"/>
-            <w:bCs/>
-            <w:lang w:val="en-GB"/>
-          </w:rPr>
-          <w:t>https://github.com</w:t>
-        </w:r>
-      </w:hyperlink>
-      <w:r>
-        <w:rPr>
-          <w:bCs/>
-          <w:lang w:val="en-GB"/>
-        </w:rPr>
-        <w:t xml:space="preserve"> </w:t>
-      </w:r>
-    </w:p>
-    <w:p>
-      <w:pPr>
-        <w:pStyle w:val="ListParagraph"/>
-        <w:numPr>
-          <w:ilvl w:val="0"/>
-          <w:numId w:val="14"/>
-        </w:numPr>
-        <w:spacing w:after="240"/>
-        <w:rPr>
-          <w:bCs/>
-          <w:lang w:val="en-GB"/>
-        </w:rPr>
-      </w:pPr>
-      <w:hyperlink r:id="rId15" w:history="1">
-        <w:r>
-          <w:rPr>
-            <w:rStyle w:val="Hyperlink"/>
-            <w:bCs/>
-            <w:lang w:val="en-GB"/>
-          </w:rPr>
-          <w:t>https://catalogue-si.unige.ch/en/stockage-recherche</w:t>
-        </w:r>
-      </w:hyperlink>
-      <w:r>
-        <w:rPr>
-          <w:bCs/>
-          <w:lang w:val="en-GB"/>
-        </w:rPr>
-        <w:t xml:space="preserve"> </w:t>
-      </w:r>
-    </w:p>
-    <w:p>
-      <w:pPr>
-        <w:spacing w:after="240"/>
-        <w:rPr>
-          <w:bCs/>
-          <w:lang w:val="en-GB"/>
-        </w:rPr>
-      </w:pPr>
-      <w:r>
-        <w:rPr>
-          <w:bCs/>
-          <w:lang w:val="en-GB"/>
-        </w:rPr>
-        <w:t>Existing data reuse:</w:t>
-      </w:r>
-    </w:p>
-    <w:p>
-      <w:pPr>
-        <w:pStyle w:val="ListParagraph"/>
-        <w:numPr>
-          <w:ilvl w:val="0"/>
-          <w:numId w:val="15"/>
-        </w:numPr>
-        <w:spacing w:after="240"/>
-        <w:rPr>
-          <w:bCs/>
-          <w:lang w:val="en-GB"/>
-        </w:rPr>
-      </w:pPr>
-      <w:hyperlink r:id="rId16" w:history="1">
-        <w:r>
-          <w:rPr>
-            <w:rStyle w:val="Hyperlink"/>
-            <w:bCs/>
-            <w:lang w:val="en-GB"/>
-          </w:rPr>
-          <w:t>https://sketchfab.com</w:t>
-        </w:r>
-      </w:hyperlink>
-    </w:p>
-    <w:p>
-      <w:pPr>
-        <w:pStyle w:val="ListParagraph"/>
-        <w:numPr>
-          <w:ilvl w:val="0"/>
-          <w:numId w:val="15"/>
-        </w:numPr>
-        <w:spacing w:after="240"/>
-        <w:rPr>
-          <w:bCs/>
-          <w:lang w:val="en-GB"/>
-        </w:rPr>
-      </w:pPr>
-      <w:hyperlink r:id="rId17" w:history="1">
-        <w:r>
-          <w:rPr>
-            <w:rStyle w:val="Hyperlink"/>
-            <w:bCs/>
-            <w:lang w:val="en-GB"/>
-          </w:rPr>
-          <w:t>https://idigbio.gbif.us</w:t>
-        </w:r>
-      </w:hyperlink>
-    </w:p>
-    <w:p>
-      <w:pPr>
-        <w:pStyle w:val="ListParagraph"/>
-        <w:numPr>
-          <w:ilvl w:val="0"/>
-          <w:numId w:val="15"/>
-        </w:numPr>
-        <w:spacing w:after="240"/>
-        <w:rPr>
-          <w:bCs/>
-          <w:lang w:val="en-GB"/>
-        </w:rPr>
-      </w:pPr>
-      <w:hyperlink r:id="rId18" w:history="1">
-        <w:r>
-          <w:rPr>
-            <w:rStyle w:val="Hyperlink"/>
-            <w:bCs/>
-            <w:lang w:val="en-GB"/>
-          </w:rPr>
-          <w:t>https://paleobiodb.org/</w:t>
-        </w:r>
-      </w:hyperlink>
-    </w:p>
-    <w:p>
-      <w:pPr>
-        <w:pStyle w:val="ListParagraph"/>
-        <w:numPr>
-          <w:ilvl w:val="0"/>
-          <w:numId w:val="15"/>
-        </w:numPr>
-        <w:spacing w:after="240"/>
-        <w:rPr>
-          <w:bCs/>
-          <w:lang w:val="en-GB"/>
-        </w:rPr>
-      </w:pPr>
-      <w:hyperlink r:id="rId19" w:history="1">
-        <w:r>
-          <w:rPr>
-            <w:rStyle w:val="Hyperlink"/>
-            <w:bCs/>
-            <w:lang w:val="en-GB"/>
-          </w:rPr>
-          <w:t>https://www.gplates.org</w:t>
-        </w:r>
-      </w:hyperlink>
-    </w:p>
-    <w:p>
-      <w:pPr>
-        <w:pStyle w:val="ListParagraph"/>
-        <w:numPr>
-          <w:ilvl w:val="0"/>
-          <w:numId w:val="15"/>
-        </w:numPr>
-        <w:spacing w:after="240"/>
-        <w:rPr>
-          <w:bCs/>
-          <w:lang w:val="en-GB"/>
-        </w:rPr>
-      </w:pPr>
-      <w:hyperlink r:id="rId20" w:history="1">
-        <w:r>
-          <w:rPr>
-            <w:rStyle w:val="Hyperlink"/>
-            <w:bCs/>
-            <w:lang w:val="en-GB"/>
-          </w:rPr>
-          <w:t>https://www.gbif.org</w:t>
-        </w:r>
-      </w:hyperlink>
-    </w:p>
-    <w:p>
-      <w:pPr>
-        <w:pStyle w:val="ListParagraph"/>
-        <w:numPr>
-          <w:ilvl w:val="0"/>
-          <w:numId w:val="15"/>
-        </w:numPr>
-        <w:spacing w:after="240"/>
-        <w:rPr>
-          <w:bCs/>
-          <w:lang w:val="en-GB"/>
-        </w:rPr>
-      </w:pPr>
-      <w:hyperlink r:id="rId21" w:history="1">
-        <w:r>
-          <w:rPr>
-            <w:rStyle w:val="Hyperlink"/>
-            <w:bCs/>
-            <w:lang w:val="en-GB"/>
-          </w:rPr>
-          <w:t>https://www.mcs.anl.gov/research/projects/foam/</w:t>
-        </w:r>
-      </w:hyperlink>
-      <w:r>
-        <w:rPr>
-          <w:bCs/>
-          <w:lang w:val="en-GB"/>
-        </w:rPr>
-        <w:t xml:space="preserve"> </w:t>
-      </w:r>
-    </w:p>
     <w:sectPr>
-      <w:headerReference w:type="default" r:id="rId22"/>
-      <w:footerReference w:type="even" r:id="rId23"/>
-      <w:footerReference w:type="default" r:id="rId24"/>
+      <w:headerReference w:type="default" r:id="rId8"/>
+      <w:footerReference w:type="even" r:id="rId9"/>
+      <w:footerReference w:type="default" r:id="rId10"/>
       <w:pgSz w:w="11906" w:h="16838" w:code="9"/>
       <w:pgMar w:top="1440" w:right="1440" w:bottom="1440" w:left="1440" w:header="708" w:footer="708" w:gutter="0"/>
       <w:cols w:space="708"/>
@@ -5748,6 +4183,119 @@
     </w:lvl>
   </w:abstractNum>
   <w:abstractNum w:abstractNumId="15" w15:restartNumberingAfterBreak="0">
+    <w:nsid w:val="5580547C"/>
+    <w:multiLevelType w:val="hybridMultilevel"/>
+    <w:tmpl w:val="E19CAF96"/>
+    <w:lvl w:ilvl="0" w:tplc="08090001">
+      <w:start w:val="1"/>
+      <w:numFmt w:val="bullet"/>
+      <w:lvlText w:val=""/>
+      <w:lvlJc w:val="left"/>
+      <w:pPr>
+        <w:ind w:left="720" w:hanging="360"/>
+      </w:pPr>
+      <w:rPr>
+        <w:rFonts w:ascii="Symbol" w:hAnsi="Symbol" w:hint="default"/>
+      </w:rPr>
+    </w:lvl>
+    <w:lvl w:ilvl="1" w:tplc="08090003" w:tentative="1">
+      <w:start w:val="1"/>
+      <w:numFmt w:val="bullet"/>
+      <w:lvlText w:val="o"/>
+      <w:lvlJc w:val="left"/>
+      <w:pPr>
+        <w:ind w:left="1440" w:hanging="360"/>
+      </w:pPr>
+      <w:rPr>
+        <w:rFonts w:ascii="Courier New" w:hAnsi="Courier New" w:cs="Courier New" w:hint="default"/>
+      </w:rPr>
+    </w:lvl>
+    <w:lvl w:ilvl="2" w:tplc="08090005" w:tentative="1">
+      <w:start w:val="1"/>
+      <w:numFmt w:val="bullet"/>
+      <w:lvlText w:val=""/>
+      <w:lvlJc w:val="left"/>
+      <w:pPr>
+        <w:ind w:left="2160" w:hanging="360"/>
+      </w:pPr>
+      <w:rPr>
+        <w:rFonts w:ascii="Wingdings" w:hAnsi="Wingdings" w:hint="default"/>
+      </w:rPr>
+    </w:lvl>
+    <w:lvl w:ilvl="3" w:tplc="08090001" w:tentative="1">
+      <w:start w:val="1"/>
+      <w:numFmt w:val="bullet"/>
+      <w:lvlText w:val=""/>
+      <w:lvlJc w:val="left"/>
+      <w:pPr>
+        <w:ind w:left="2880" w:hanging="360"/>
+      </w:pPr>
+      <w:rPr>
+        <w:rFonts w:ascii="Symbol" w:hAnsi="Symbol" w:hint="default"/>
+      </w:rPr>
+    </w:lvl>
+    <w:lvl w:ilvl="4" w:tplc="08090003" w:tentative="1">
+      <w:start w:val="1"/>
+      <w:numFmt w:val="bullet"/>
+      <w:lvlText w:val="o"/>
+      <w:lvlJc w:val="left"/>
+      <w:pPr>
+        <w:ind w:left="3600" w:hanging="360"/>
+      </w:pPr>
+      <w:rPr>
+        <w:rFonts w:ascii="Courier New" w:hAnsi="Courier New" w:cs="Courier New" w:hint="default"/>
+      </w:rPr>
+    </w:lvl>
+    <w:lvl w:ilvl="5" w:tplc="08090005" w:tentative="1">
+      <w:start w:val="1"/>
+      <w:numFmt w:val="bullet"/>
+      <w:lvlText w:val=""/>
+      <w:lvlJc w:val="left"/>
+      <w:pPr>
+        <w:ind w:left="4320" w:hanging="360"/>
+      </w:pPr>
+      <w:rPr>
+        <w:rFonts w:ascii="Wingdings" w:hAnsi="Wingdings" w:hint="default"/>
+      </w:rPr>
+    </w:lvl>
+    <w:lvl w:ilvl="6" w:tplc="08090001" w:tentative="1">
+      <w:start w:val="1"/>
+      <w:numFmt w:val="bullet"/>
+      <w:lvlText w:val=""/>
+      <w:lvlJc w:val="left"/>
+      <w:pPr>
+        <w:ind w:left="5040" w:hanging="360"/>
+      </w:pPr>
+      <w:rPr>
+        <w:rFonts w:ascii="Symbol" w:hAnsi="Symbol" w:hint="default"/>
+      </w:rPr>
+    </w:lvl>
+    <w:lvl w:ilvl="7" w:tplc="08090003" w:tentative="1">
+      <w:start w:val="1"/>
+      <w:numFmt w:val="bullet"/>
+      <w:lvlText w:val="o"/>
+      <w:lvlJc w:val="left"/>
+      <w:pPr>
+        <w:ind w:left="5760" w:hanging="360"/>
+      </w:pPr>
+      <w:rPr>
+        <w:rFonts w:ascii="Courier New" w:hAnsi="Courier New" w:cs="Courier New" w:hint="default"/>
+      </w:rPr>
+    </w:lvl>
+    <w:lvl w:ilvl="8" w:tplc="08090005" w:tentative="1">
+      <w:start w:val="1"/>
+      <w:numFmt w:val="bullet"/>
+      <w:lvlText w:val=""/>
+      <w:lvlJc w:val="left"/>
+      <w:pPr>
+        <w:ind w:left="6480" w:hanging="360"/>
+      </w:pPr>
+      <w:rPr>
+        <w:rFonts w:ascii="Wingdings" w:hAnsi="Wingdings" w:hint="default"/>
+      </w:rPr>
+    </w:lvl>
+  </w:abstractNum>
+  <w:abstractNum w:abstractNumId="16" w15:restartNumberingAfterBreak="0">
     <w:nsid w:val="6D09410F"/>
     <w:multiLevelType w:val="hybridMultilevel"/>
     <w:tmpl w:val="1960C8F8"/>
@@ -5860,10 +4408,10 @@
       </w:rPr>
     </w:lvl>
   </w:abstractNum>
-  <w:abstractNum w:abstractNumId="16" w15:restartNumberingAfterBreak="0">
+  <w:abstractNum w:abstractNumId="17" w15:restartNumberingAfterBreak="0">
     <w:nsid w:val="7158120F"/>
     <w:multiLevelType w:val="hybridMultilevel"/>
-    <w:tmpl w:val="089CAC52"/>
+    <w:tmpl w:val="D4E849CA"/>
     <w:lvl w:ilvl="0" w:tplc="08090001">
       <w:start w:val="1"/>
       <w:numFmt w:val="bullet"/>
@@ -5973,7 +4521,7 @@
       </w:rPr>
     </w:lvl>
   </w:abstractNum>
-  <w:abstractNum w:abstractNumId="17" w15:restartNumberingAfterBreak="0">
+  <w:abstractNum w:abstractNumId="18" w15:restartNumberingAfterBreak="0">
     <w:nsid w:val="76DF152A"/>
     <w:multiLevelType w:val="hybridMultilevel"/>
     <w:tmpl w:val="4D529AC0"/>
@@ -6096,7 +4644,7 @@
     <w:abstractNumId w:val="2"/>
   </w:num>
   <w:num w:numId="4" w16cid:durableId="333647531">
-    <w:abstractNumId w:val="16"/>
+    <w:abstractNumId w:val="17"/>
   </w:num>
   <w:num w:numId="5" w16cid:durableId="74909867">
     <w:abstractNumId w:val="13"/>
@@ -6117,7 +4665,7 @@
     <w:abstractNumId w:val="6"/>
   </w:num>
   <w:num w:numId="11" w16cid:durableId="1352418824">
-    <w:abstractNumId w:val="17"/>
+    <w:abstractNumId w:val="18"/>
   </w:num>
   <w:num w:numId="12" w16cid:durableId="95443301">
     <w:abstractNumId w:val="4"/>
@@ -6129,7 +4677,7 @@
     <w:abstractNumId w:val="9"/>
   </w:num>
   <w:num w:numId="15" w16cid:durableId="558247304">
-    <w:abstractNumId w:val="15"/>
+    <w:abstractNumId w:val="16"/>
   </w:num>
   <w:num w:numId="16" w16cid:durableId="1025256919">
     <w:abstractNumId w:val="8"/>
@@ -6139,6 +4687,9 @@
   </w:num>
   <w:num w:numId="18" w16cid:durableId="1903173173">
     <w:abstractNumId w:val="3"/>
+  </w:num>
+  <w:num w:numId="19" w16cid:durableId="1681931329">
+    <w:abstractNumId w:val="15"/>
   </w:num>
 </w:numbering>
 </file>

</xml_diff>